<commit_message>
Fix mistake in task and change the internal title.
</commit_message>
<xml_diff>
--- a/task/vkr_task.docx
+++ b/task/vkr_task.docx
@@ -190,7 +190,7 @@
     </w:p>
     <w:tbl>
       <w:tblPr>
-        <w:tblStyle w:val="906"/>
+        <w:tblStyle w:val="916"/>
         <w:tblInd w:w="675" w:type="dxa"/>
         <w:tblW w:w="0" w:type="auto"/>
         <w:tblBorders>
@@ -1058,7 +1058,7 @@
                 <w:szCs w:val="24"/>
                 <w:lang w:val="ru-RU"/>
               </w:rPr>
-              <w:t xml:space="preserve">Заф</w:t>
+              <w:t xml:space="preserve">Зав</w:t>
             </w:r>
             <w:r>
               <w:rPr>
@@ -1753,7 +1753,7 @@
     </w:p>
     <w:tbl>
       <w:tblPr>
-        <w:tblStyle w:val="906"/>
+        <w:tblStyle w:val="916"/>
         <w:tblW w:w="0" w:type="auto"/>
         <w:tblBorders>
           <w:top w:val="none" w:color="auto" w:sz="0" w:space="0"/>
@@ -1790,7 +1790,7 @@
           </w:tcPr>
           <w:p>
             <w:pPr>
-              <w:pStyle w:val="905"/>
+              <w:pStyle w:val="915"/>
               <w:widowControl w:val="true"/>
               <w:numPr>
                 <w:ilvl w:val="0"/>
@@ -1882,7 +1882,7 @@
           </w:tcPr>
           <w:p>
             <w:pPr>
-              <w:pStyle w:val="905"/>
+              <w:pStyle w:val="915"/>
               <w:widowControl w:val="true"/>
               <w:pBdr/>
               <w:spacing/>
@@ -2100,7 +2100,7 @@
           </w:tcPr>
           <w:p>
             <w:pPr>
-              <w:pStyle w:val="905"/>
+              <w:pStyle w:val="915"/>
               <w:widowControl w:val="true"/>
               <w:pBdr/>
               <w:spacing/>
@@ -2275,7 +2275,7 @@
           </w:tcPr>
           <w:p>
             <w:pPr>
-              <w:pStyle w:val="905"/>
+              <w:pStyle w:val="915"/>
               <w:widowControl w:val="true"/>
               <w:pBdr/>
               <w:spacing/>
@@ -2346,7 +2346,7 @@
           </w:tcPr>
           <w:p>
             <w:pPr>
-              <w:pStyle w:val="905"/>
+              <w:pStyle w:val="915"/>
               <w:widowControl w:val="true"/>
               <w:numPr>
                 <w:ilvl w:val="0"/>
@@ -2525,7 +2525,7 @@
           </w:tcPr>
           <w:p>
             <w:pPr>
-              <w:pStyle w:val="905"/>
+              <w:pStyle w:val="915"/>
               <w:widowControl w:val="true"/>
               <w:pBdr/>
               <w:spacing/>
@@ -2665,7 +2665,7 @@
           </w:tcPr>
           <w:p>
             <w:pPr>
-              <w:pStyle w:val="905"/>
+              <w:pStyle w:val="915"/>
               <w:widowControl w:val="true"/>
               <w:pBdr/>
               <w:spacing/>
@@ -2736,7 +2736,7 @@
           </w:tcPr>
           <w:p>
             <w:pPr>
-              <w:pStyle w:val="905"/>
+              <w:pStyle w:val="915"/>
               <w:widowControl w:val="true"/>
               <w:numPr>
                 <w:ilvl w:val="0"/>
@@ -2806,10 +2806,19 @@
               <w:rPr>
                 <w:sz w:val="26"/>
                 <w:szCs w:val="26"/>
+                <w:highlight w:val="none"/>
+                <w:lang w:val="ru-RU"/>
+              </w:rPr>
+              <w:t xml:space="preserve">25</w:t>
+            </w:r>
+            <w:r>
+              <w:rPr>
+                <w:sz w:val="26"/>
+                <w:szCs w:val="26"/>
                 <w:highlight w:val="white"/>
                 <w:lang w:val="ru-RU"/>
               </w:rPr>
-              <w:t xml:space="preserve">12 июня 20</w:t>
+              <w:t xml:space="preserve"> июня 20</w:t>
             </w:r>
             <w:r>
               <w:rPr>
@@ -2855,7 +2864,7 @@
           </w:tcPr>
           <w:p>
             <w:pPr>
-              <w:pStyle w:val="905"/>
+              <w:pStyle w:val="915"/>
               <w:widowControl w:val="true"/>
               <w:pBdr/>
               <w:spacing/>
@@ -2926,7 +2935,7 @@
           </w:tcPr>
           <w:p>
             <w:pPr>
-              <w:pStyle w:val="905"/>
+              <w:pStyle w:val="915"/>
               <w:widowControl w:val="true"/>
               <w:numPr>
                 <w:ilvl w:val="0"/>
@@ -3063,7 +3072,7 @@
           </w:tcPr>
           <w:p>
             <w:pPr>
-              <w:pStyle w:val="905"/>
+              <w:pStyle w:val="915"/>
               <w:widowControl w:val="true"/>
               <w:pBdr/>
               <w:spacing/>
@@ -3150,7 +3159,7 @@
           </w:tcPr>
           <w:p>
             <w:pPr>
-              <w:pStyle w:val="905"/>
+              <w:pStyle w:val="915"/>
               <w:widowControl w:val="true"/>
               <w:numPr>
                 <w:ilvl w:val="0"/>
@@ -3242,7 +3251,7 @@
           </w:tcPr>
           <w:p>
             <w:pPr>
-              <w:pStyle w:val="905"/>
+              <w:pStyle w:val="915"/>
               <w:widowControl w:val="true"/>
               <w:pBdr/>
               <w:spacing/>
@@ -3544,7 +3553,7 @@
           </w:tcPr>
           <w:p>
             <w:pPr>
-              <w:pStyle w:val="905"/>
+              <w:pStyle w:val="915"/>
               <w:widowControl w:val="true"/>
               <w:pBdr/>
               <w:spacing/>
@@ -3785,7 +3794,7 @@
           </w:tcPr>
           <w:p>
             <w:pPr>
-              <w:pStyle w:val="905"/>
+              <w:pStyle w:val="915"/>
               <w:widowControl w:val="true"/>
               <w:pBdr/>
               <w:spacing/>
@@ -3856,7 +3865,7 @@
           </w:tcPr>
           <w:p>
             <w:pPr>
-              <w:pStyle w:val="905"/>
+              <w:pStyle w:val="915"/>
               <w:widowControl w:val="true"/>
               <w:numPr>
                 <w:ilvl w:val="0"/>
@@ -3964,7 +3973,7 @@
           </w:tcPr>
           <w:p>
             <w:pPr>
-              <w:pStyle w:val="905"/>
+              <w:pStyle w:val="915"/>
               <w:widowControl w:val="true"/>
               <w:pBdr/>
               <w:spacing/>
@@ -4264,7 +4273,7 @@
           </w:tcPr>
           <w:p>
             <w:pPr>
-              <w:pStyle w:val="905"/>
+              <w:pStyle w:val="915"/>
               <w:widowControl w:val="true"/>
               <w:pBdr/>
               <w:spacing/>
@@ -4505,7 +4514,7 @@
           </w:tcPr>
           <w:p>
             <w:pPr>
-              <w:pStyle w:val="905"/>
+              <w:pStyle w:val="915"/>
               <w:widowControl w:val="true"/>
               <w:pBdr/>
               <w:spacing/>
@@ -4576,7 +4585,7 @@
           </w:tcPr>
           <w:p>
             <w:pPr>
-              <w:pStyle w:val="905"/>
+              <w:pStyle w:val="915"/>
               <w:widowControl w:val="true"/>
               <w:numPr>
                 <w:ilvl w:val="0"/>
@@ -4676,7 +4685,7 @@
           </w:tcPr>
           <w:p>
             <w:pPr>
-              <w:pStyle w:val="905"/>
+              <w:pStyle w:val="915"/>
               <w:widowControl w:val="true"/>
               <w:pBdr/>
               <w:spacing/>
@@ -4976,7 +4985,7 @@
           </w:tcPr>
           <w:p>
             <w:pPr>
-              <w:pStyle w:val="905"/>
+              <w:pStyle w:val="915"/>
               <w:widowControl w:val="true"/>
               <w:pBdr/>
               <w:spacing/>
@@ -5316,7 +5325,7 @@
     </w:p>
     <w:p>
       <w:pPr>
-        <w:pStyle w:val="905"/>
+        <w:pStyle w:val="915"/>
         <w:widowControl w:val="true"/>
         <w:numPr>
           <w:ilvl w:val="0"/>
@@ -5364,7 +5373,7 @@
     </w:p>
     <w:p>
       <w:pPr>
-        <w:pStyle w:val="905"/>
+        <w:pStyle w:val="915"/>
         <w:widowControl w:val="true"/>
         <w:numPr>
           <w:ilvl w:val="0"/>
@@ -5408,7 +5417,7 @@
     </w:p>
     <w:p>
       <w:pPr>
-        <w:pStyle w:val="905"/>
+        <w:pStyle w:val="915"/>
         <w:widowControl w:val="true"/>
         <w:numPr>
           <w:ilvl w:val="0"/>
@@ -5473,10 +5482,16 @@
           <w:lang w:val="ru-RU"/>
         </w:rPr>
       </w:r>
+      <w:r>
+        <w:rPr>
+          <w:sz w:val="24"/>
+          <w:lang w:val="ru-RU"/>
+        </w:rPr>
+      </w:r>
     </w:p>
     <w:p>
       <w:pPr>
-        <w:pStyle w:val="905"/>
+        <w:pStyle w:val="915"/>
         <w:widowControl w:val="true"/>
         <w:numPr>
           <w:ilvl w:val="0"/>
@@ -5518,10 +5533,16 @@
           <w:lang w:val="ru-RU"/>
         </w:rPr>
       </w:r>
+      <w:r>
+        <w:rPr>
+          <w:sz w:val="24"/>
+          <w:lang w:val="ru-RU"/>
+        </w:rPr>
+      </w:r>
     </w:p>
     <w:p>
       <w:pPr>
-        <w:pStyle w:val="905"/>
+        <w:pStyle w:val="915"/>
         <w:widowControl w:val="true"/>
         <w:numPr>
           <w:ilvl w:val="0"/>
@@ -5591,7 +5612,7 @@
     </w:p>
     <w:p>
       <w:pPr>
-        <w:pStyle w:val="905"/>
+        <w:pStyle w:val="915"/>
         <w:widowControl w:val="true"/>
         <w:numPr>
           <w:ilvl w:val="0"/>
@@ -5631,7 +5652,7 @@
     </w:p>
     <w:p>
       <w:pPr>
-        <w:pStyle w:val="905"/>
+        <w:pStyle w:val="915"/>
         <w:widowControl w:val="true"/>
         <w:numPr>
           <w:ilvl w:val="0"/>
@@ -5666,10 +5687,16 @@
           <w:lang w:val="ru-RU"/>
         </w:rPr>
       </w:r>
+      <w:r>
+        <w:rPr>
+          <w:sz w:val="24"/>
+          <w:lang w:val="ru-RU"/>
+        </w:rPr>
+      </w:r>
     </w:p>
     <w:p>
       <w:pPr>
-        <w:pStyle w:val="905"/>
+        <w:pStyle w:val="915"/>
         <w:widowControl w:val="true"/>
         <w:numPr>
           <w:ilvl w:val="0"/>
@@ -5696,7 +5723,13 @@
           <w:sz w:val="24"/>
           <w:lang w:val="ru-RU"/>
         </w:rPr>
-        <w:t xml:space="preserve">записей журнала для разрабатываемого метода реализации многоверсионности</w:t>
+        <w:t xml:space="preserve">записей журнала, хранящего предыдущие версии строк для разрабатываемого метода реализации многоверсионности</w:t>
+      </w:r>
+      <w:r>
+        <w:rPr>
+          <w:sz w:val="24"/>
+          <w:lang w:val="ru-RU"/>
+        </w:rPr>
       </w:r>
       <w:r>
         <w:rPr>
@@ -5707,7 +5740,7 @@
     </w:p>
     <w:p>
       <w:pPr>
-        <w:pStyle w:val="905"/>
+        <w:pStyle w:val="915"/>
         <w:widowControl w:val="true"/>
         <w:numPr>
           <w:ilvl w:val="0"/>
@@ -5741,6 +5774,12 @@
           <w:lang w:val="ru-RU"/>
         </w:rPr>
       </w:r>
+      <w:r>
+        <w:rPr>
+          <w:sz w:val="24"/>
+          <w:lang w:val="ru-RU"/>
+        </w:rPr>
+      </w:r>
     </w:p>
     <w:p>
       <w:pPr>
@@ -5765,14 +5804,14 @@
       <w:r>
         <w:rPr>
           <w:sz w:val="24"/>
-          <w:highlight w:val="none"/>
-          <w:lang w:val="ru-RU" w:bidi="ru-RU"/>
+          <w:szCs w:val="24"/>
+          <w:lang w:val="ru-RU"/>
         </w:rPr>
       </w:r>
       <w:r>
         <w:rPr>
           <w:sz w:val="24"/>
-          <w:highlight w:val="none"/>
+          <w:szCs w:val="24"/>
           <w:lang w:val="ru-RU"/>
         </w:rPr>
       </w:r>
@@ -5818,7 +5857,7 @@
     </w:p>
     <w:p>
       <w:pPr>
-        <w:pStyle w:val="905"/>
+        <w:pStyle w:val="915"/>
         <w:widowControl w:val="true"/>
         <w:numPr>
           <w:ilvl w:val="1"/>
@@ -5858,7 +5897,7 @@
     </w:p>
     <w:p>
       <w:pPr>
-        <w:pStyle w:val="905"/>
+        <w:pStyle w:val="915"/>
         <w:widowControl w:val="true"/>
         <w:numPr>
           <w:ilvl w:val="0"/>
@@ -5900,10 +5939,16 @@
           <w:lang w:val="ru-RU"/>
         </w:rPr>
       </w:r>
+      <w:r>
+        <w:rPr>
+          <w:sz w:val="24"/>
+          <w:lang w:val="ru-RU"/>
+        </w:rPr>
+      </w:r>
     </w:p>
     <w:p>
       <w:pPr>
-        <w:pStyle w:val="905"/>
+        <w:pStyle w:val="915"/>
         <w:widowControl w:val="true"/>
         <w:numPr>
           <w:ilvl w:val="0"/>
@@ -5924,6 +5969,12 @@
           <w:lang w:val="ru-RU"/>
         </w:rPr>
         <w:t xml:space="preserve">Спроектировать интеграцию разрабатываемого расширения с системой управления базами данных</w:t>
+      </w:r>
+      <w:r>
+        <w:rPr>
+          <w:sz w:val="24"/>
+          <w:lang w:val="ru-RU"/>
+        </w:rPr>
       </w:r>
       <w:r>
         <w:rPr>
@@ -5960,7 +6011,7 @@
     </w:p>
     <w:p>
       <w:pPr>
-        <w:pStyle w:val="905"/>
+        <w:pStyle w:val="915"/>
         <w:widowControl w:val="true"/>
         <w:numPr>
           <w:ilvl w:val="1"/>
@@ -6006,7 +6057,7 @@
     </w:p>
     <w:p>
       <w:pPr>
-        <w:pStyle w:val="905"/>
+        <w:pStyle w:val="915"/>
         <w:widowControl w:val="true"/>
         <w:numPr>
           <w:ilvl w:val="0"/>
@@ -6055,10 +6106,16 @@
           <w:lang w:val="ru-RU"/>
         </w:rPr>
       </w:r>
+      <w:r>
+        <w:rPr>
+          <w:sz w:val="24"/>
+          <w:lang w:val="ru-RU"/>
+        </w:rPr>
+      </w:r>
     </w:p>
     <w:p>
       <w:pPr>
-        <w:pStyle w:val="905"/>
+        <w:pStyle w:val="915"/>
         <w:widowControl w:val="true"/>
         <w:numPr>
           <w:ilvl w:val="0"/>
@@ -6078,14 +6135,14 @@
           <w:sz w:val="24"/>
           <w:lang w:val="ru-RU"/>
         </w:rPr>
-        <w:t xml:space="preserve">Для реализации взаимодействия с интерфейсами СУБД предлагается использовать предоставляемый </w:t>
+        <w:t xml:space="preserve">Для реализации взаимодействия с интерфейсами СУБД предлагается использовать </w:t>
       </w:r>
       <w:r>
         <w:rPr>
           <w:sz w:val="24"/>
           <w:lang w:val="en-US"/>
         </w:rPr>
-        <w:t xml:space="preserve">PostgreSQL API </w:t>
+        <w:t xml:space="preserve">API </w:t>
       </w:r>
       <w:r>
         <w:rPr>
@@ -6100,10 +6157,16 @@
           <w:lang w:val="ru-RU"/>
         </w:rPr>
       </w:r>
+      <w:r>
+        <w:rPr>
+          <w:sz w:val="24"/>
+          <w:lang w:val="ru-RU"/>
+        </w:rPr>
+      </w:r>
     </w:p>
     <w:p>
       <w:pPr>
-        <w:pStyle w:val="905"/>
+        <w:pStyle w:val="915"/>
         <w:widowControl w:val="true"/>
         <w:numPr>
           <w:ilvl w:val="0"/>
@@ -6170,14 +6233,14 @@
       <w:r>
         <w:rPr>
           <w:sz w:val="24"/>
-          <w:highlight w:val="none"/>
-          <w:lang w:val="ru-RU" w:bidi="ru-RU"/>
+          <w:szCs w:val="24"/>
+          <w:lang w:val="ru-RU"/>
         </w:rPr>
       </w:r>
       <w:r>
         <w:rPr>
           <w:sz w:val="24"/>
-          <w:highlight w:val="none"/>
+          <w:szCs w:val="24"/>
           <w:lang w:val="ru-RU"/>
         </w:rPr>
       </w:r>
@@ -6241,7 +6304,7 @@
     </w:p>
     <w:p>
       <w:pPr>
-        <w:pStyle w:val="905"/>
+        <w:pStyle w:val="915"/>
         <w:widowControl w:val="true"/>
         <w:numPr>
           <w:ilvl w:val="0"/>
@@ -6281,7 +6344,7 @@
     </w:p>
     <w:p>
       <w:pPr>
-        <w:pStyle w:val="905"/>
+        <w:pStyle w:val="915"/>
         <w:widowControl w:val="true"/>
         <w:numPr>
           <w:ilvl w:val="0"/>
@@ -6323,10 +6386,16 @@
           <w:lang w:val="ru-RU"/>
         </w:rPr>
       </w:r>
+      <w:r>
+        <w:rPr>
+          <w:sz w:val="24"/>
+          <w:lang w:val="ru-RU"/>
+        </w:rPr>
+      </w:r>
     </w:p>
     <w:p>
       <w:pPr>
-        <w:pStyle w:val="905"/>
+        <w:pStyle w:val="915"/>
         <w:widowControl w:val="true"/>
         <w:numPr>
           <w:ilvl w:val="0"/>
@@ -6356,7 +6425,7 @@
           <w:highlight w:val="none"/>
           <w:lang w:val="ru-RU" w:bidi="ru-RU"/>
         </w:rPr>
-        <w:t xml:space="preserve">ой чертой </w:t>
+        <w:t xml:space="preserve">ыми чертами </w:t>
       </w:r>
       <w:r>
         <w:rPr>
@@ -6364,7 +6433,39 @@
           <w:highlight w:val="none"/>
           <w:lang w:val="ru-RU" w:bidi="ru-RU"/>
         </w:rPr>
-        <w:t xml:space="preserve">разрабатываемой библиотеки является производительность запросов в сравнении с </w:t>
+        <w:t xml:space="preserve">разрабатываемой библиотеки являются простота ее сборки и интеграции с имеющимся сервером </w:t>
+      </w:r>
+      <w:r>
+        <w:rPr>
+          <w:sz w:val="24"/>
+          <w:highlight w:val="none"/>
+          <w:lang w:val="en-US"/>
+        </w:rPr>
+        <w:t xml:space="preserve">Postgres (</w:t>
+      </w:r>
+      <w:r>
+        <w:rPr>
+          <w:sz w:val="24"/>
+          <w:highlight w:val="none"/>
+          <w:lang w:val="ru-RU"/>
+        </w:rPr>
+        <w:t xml:space="preserve">как системным, так и пользовательским</w:t>
+      </w:r>
+      <w:r>
+        <w:rPr>
+          <w:sz w:val="24"/>
+          <w:highlight w:val="none"/>
+          <w:lang w:val="en-US"/>
+        </w:rPr>
+        <w:t xml:space="preserve">)</w:t>
+      </w:r>
+      <w:r>
+        <w:rPr>
+          <w:sz w:val="24"/>
+          <w:highlight w:val="none"/>
+          <w:lang w:val="ru-RU" w:bidi="ru-RU"/>
+        </w:rPr>
+        <w:t xml:space="preserve">, а также повышенная производительность запросов в сравнении с </w:t>
       </w:r>
       <w:r>
         <w:rPr>
@@ -6393,7 +6494,14 @@
       <w:r>
         <w:rPr>
           <w:sz w:val="24"/>
-          <w:highlight w:val="none"/>
+          <w:szCs w:val="24"/>
+          <w:lang w:val="ru-RU"/>
+        </w:rPr>
+      </w:r>
+      <w:r>
+        <w:rPr>
+          <w:sz w:val="24"/>
+          <w:szCs w:val="24"/>
           <w:lang w:val="ru-RU"/>
         </w:rPr>
       </w:r>
@@ -6579,17 +6687,9 @@
       </w:r>
       <w:r>
         <w:rPr>
-          <w:highlight w:val="white"/>
-          <w:lang w:val="ru-RU"/>
+          <w:lang w:val="en-US"/>
         </w:rPr>
-        <w:t xml:space="preserve">0</w:t>
-      </w:r>
-      <w:r>
-        <w:rPr>
-          <w:highlight w:val="white"/>
-          <w:lang w:val="ru-RU"/>
-        </w:rPr>
-        <w:t xml:space="preserve">5</w:t>
+        <w:t xml:space="preserve">10</w:t>
       </w:r>
       <w:r>
         <w:rPr>
@@ -6607,19 +6707,7 @@
         <w:rPr>
           <w:lang w:val="ru-RU"/>
         </w:rPr>
-        <w:t xml:space="preserve">июня</w:t>
-      </w:r>
-      <w:r>
-        <w:rPr>
-          <w:lang w:val="ru-RU"/>
-        </w:rPr>
-        <w:t xml:space="preserve">  </w:t>
-      </w:r>
-      <w:r>
-        <w:rPr>
-          <w:lang w:val="ru-RU"/>
-        </w:rPr>
-        <w:t xml:space="preserve">20</w:t>
+        <w:t xml:space="preserve">апреля 20</w:t>
       </w:r>
       <w:r>
         <w:rPr>
@@ -8516,9 +8604,9 @@
     <w:lsdException w:name="Bibliography" w:uiPriority="37"/>
     <w:lsdException w:name="TOC Heading" w:uiPriority="39" w:qFormat="1"/>
   </w:latentStyles>
-  <w:style w:type="table" w:styleId="713">
+  <w:style w:type="table" w:styleId="723">
     <w:name w:val="Table Grid Light"/>
-    <w:basedOn w:val="899"/>
+    <w:basedOn w:val="909"/>
     <w:uiPriority w:val="59"/>
     <w:pPr>
       <w:pBdr/>
@@ -8715,9 +8803,9 @@
       </w:tcPr>
     </w:tblStylePr>
   </w:style>
-  <w:style w:type="table" w:styleId="714">
+  <w:style w:type="table" w:styleId="724">
     <w:name w:val="Plain Table 1"/>
-    <w:basedOn w:val="899"/>
+    <w:basedOn w:val="909"/>
     <w:uiPriority w:val="59"/>
     <w:pPr>
       <w:pBdr/>
@@ -8940,9 +9028,9 @@
       </w:tcPr>
     </w:tblStylePr>
   </w:style>
-  <w:style w:type="table" w:styleId="715">
+  <w:style w:type="table" w:styleId="725">
     <w:name w:val="Plain Table 2"/>
-    <w:basedOn w:val="899"/>
+    <w:basedOn w:val="909"/>
     <w:uiPriority w:val="59"/>
     <w:pPr>
       <w:pBdr/>
@@ -9173,9 +9261,9 @@
       </w:tcPr>
     </w:tblStylePr>
   </w:style>
-  <w:style w:type="table" w:styleId="716">
+  <w:style w:type="table" w:styleId="726">
     <w:name w:val="Plain Table 3"/>
-    <w:basedOn w:val="899"/>
+    <w:basedOn w:val="909"/>
     <w:uiPriority w:val="99"/>
     <w:pPr>
       <w:pBdr/>
@@ -9403,9 +9491,9 @@
       </w:tcPr>
     </w:tblStylePr>
   </w:style>
-  <w:style w:type="table" w:styleId="717">
+  <w:style w:type="table" w:styleId="727">
     <w:name w:val="Plain Table 4"/>
-    <w:basedOn w:val="899"/>
+    <w:basedOn w:val="909"/>
     <w:uiPriority w:val="99"/>
     <w:pPr>
       <w:pBdr/>
@@ -9619,9 +9707,9 @@
       </w:tcPr>
     </w:tblStylePr>
   </w:style>
-  <w:style w:type="table" w:styleId="718">
+  <w:style w:type="table" w:styleId="728">
     <w:name w:val="Plain Table 5"/>
-    <w:basedOn w:val="899"/>
+    <w:basedOn w:val="909"/>
     <w:uiPriority w:val="99"/>
     <w:pPr>
       <w:pBdr/>
@@ -9852,9 +9940,9 @@
       </w:tcPr>
     </w:tblStylePr>
   </w:style>
-  <w:style w:type="table" w:styleId="719">
+  <w:style w:type="table" w:styleId="729">
     <w:name w:val="Grid Table 1 Light"/>
-    <w:basedOn w:val="899"/>
+    <w:basedOn w:val="909"/>
     <w:uiPriority w:val="99"/>
     <w:pPr>
       <w:pBdr/>
@@ -10075,9 +10163,9 @@
       </w:tcPr>
     </w:tblStylePr>
   </w:style>
-  <w:style w:type="table" w:styleId="720">
+  <w:style w:type="table" w:styleId="730">
     <w:name w:val="Grid Table 1 Light - Accent 1"/>
-    <w:basedOn w:val="899"/>
+    <w:basedOn w:val="909"/>
     <w:uiPriority w:val="99"/>
     <w:pPr>
       <w:pBdr/>
@@ -10298,9 +10386,9 @@
       </w:tcPr>
     </w:tblStylePr>
   </w:style>
-  <w:style w:type="table" w:styleId="721">
+  <w:style w:type="table" w:styleId="731">
     <w:name w:val="Grid Table 1 Light - Accent 2"/>
-    <w:basedOn w:val="899"/>
+    <w:basedOn w:val="909"/>
     <w:uiPriority w:val="99"/>
     <w:pPr>
       <w:pBdr/>
@@ -10521,9 +10609,9 @@
       </w:tcPr>
     </w:tblStylePr>
   </w:style>
-  <w:style w:type="table" w:styleId="722">
+  <w:style w:type="table" w:styleId="732">
     <w:name w:val="Grid Table 1 Light - Accent 3"/>
-    <w:basedOn w:val="899"/>
+    <w:basedOn w:val="909"/>
     <w:uiPriority w:val="99"/>
     <w:pPr>
       <w:pBdr/>
@@ -10744,9 +10832,9 @@
       </w:tcPr>
     </w:tblStylePr>
   </w:style>
-  <w:style w:type="table" w:styleId="723">
+  <w:style w:type="table" w:styleId="733">
     <w:name w:val="Grid Table 1 Light - Accent 4"/>
-    <w:basedOn w:val="899"/>
+    <w:basedOn w:val="909"/>
     <w:uiPriority w:val="99"/>
     <w:pPr>
       <w:pBdr/>
@@ -10967,9 +11055,9 @@
       </w:tcPr>
     </w:tblStylePr>
   </w:style>
-  <w:style w:type="table" w:styleId="724">
+  <w:style w:type="table" w:styleId="734">
     <w:name w:val="Grid Table 1 Light - Accent 5"/>
-    <w:basedOn w:val="899"/>
+    <w:basedOn w:val="909"/>
     <w:uiPriority w:val="99"/>
     <w:pPr>
       <w:pBdr/>
@@ -11190,9 +11278,9 @@
       </w:tcPr>
     </w:tblStylePr>
   </w:style>
-  <w:style w:type="table" w:styleId="725">
+  <w:style w:type="table" w:styleId="735">
     <w:name w:val="Grid Table 1 Light - Accent 6"/>
-    <w:basedOn w:val="899"/>
+    <w:basedOn w:val="909"/>
     <w:uiPriority w:val="99"/>
     <w:pPr>
       <w:pBdr/>
@@ -11413,9 +11501,9 @@
       </w:tcPr>
     </w:tblStylePr>
   </w:style>
-  <w:style w:type="table" w:styleId="726">
+  <w:style w:type="table" w:styleId="736">
     <w:name w:val="Grid Table 2"/>
-    <w:basedOn w:val="899"/>
+    <w:basedOn w:val="909"/>
     <w:uiPriority w:val="99"/>
     <w:pPr>
       <w:pBdr/>
@@ -11645,9 +11733,9 @@
       </w:tcPr>
     </w:tblStylePr>
   </w:style>
-  <w:style w:type="table" w:styleId="727">
+  <w:style w:type="table" w:styleId="737">
     <w:name w:val="Grid Table 2 - Accent 1"/>
-    <w:basedOn w:val="899"/>
+    <w:basedOn w:val="909"/>
     <w:uiPriority w:val="99"/>
     <w:pPr>
       <w:pBdr/>
@@ -11877,9 +11965,9 @@
       </w:tcPr>
     </w:tblStylePr>
   </w:style>
-  <w:style w:type="table" w:styleId="728">
+  <w:style w:type="table" w:styleId="738">
     <w:name w:val="Grid Table 2 - Accent 2"/>
-    <w:basedOn w:val="899"/>
+    <w:basedOn w:val="909"/>
     <w:uiPriority w:val="99"/>
     <w:pPr>
       <w:pBdr/>
@@ -12109,9 +12197,9 @@
       </w:tcPr>
     </w:tblStylePr>
   </w:style>
-  <w:style w:type="table" w:styleId="729">
+  <w:style w:type="table" w:styleId="739">
     <w:name w:val="Grid Table 2 - Accent 3"/>
-    <w:basedOn w:val="899"/>
+    <w:basedOn w:val="909"/>
     <w:uiPriority w:val="99"/>
     <w:pPr>
       <w:pBdr/>
@@ -12341,9 +12429,9 @@
       </w:tcPr>
     </w:tblStylePr>
   </w:style>
-  <w:style w:type="table" w:styleId="730">
+  <w:style w:type="table" w:styleId="740">
     <w:name w:val="Grid Table 2 - Accent 4"/>
-    <w:basedOn w:val="899"/>
+    <w:basedOn w:val="909"/>
     <w:uiPriority w:val="99"/>
     <w:pPr>
       <w:pBdr/>
@@ -12573,9 +12661,9 @@
       </w:tcPr>
     </w:tblStylePr>
   </w:style>
-  <w:style w:type="table" w:styleId="731">
+  <w:style w:type="table" w:styleId="741">
     <w:name w:val="Grid Table 2 - Accent 5"/>
-    <w:basedOn w:val="899"/>
+    <w:basedOn w:val="909"/>
     <w:uiPriority w:val="99"/>
     <w:pPr>
       <w:pBdr/>
@@ -12805,9 +12893,9 @@
       </w:tcPr>
     </w:tblStylePr>
   </w:style>
-  <w:style w:type="table" w:styleId="732">
+  <w:style w:type="table" w:styleId="742">
     <w:name w:val="Grid Table 2 - Accent 6"/>
-    <w:basedOn w:val="899"/>
+    <w:basedOn w:val="909"/>
     <w:uiPriority w:val="99"/>
     <w:pPr>
       <w:pBdr/>
@@ -13037,9 +13125,9 @@
       </w:tcPr>
     </w:tblStylePr>
   </w:style>
-  <w:style w:type="table" w:styleId="733">
+  <w:style w:type="table" w:styleId="743">
     <w:name w:val="Grid Table 3"/>
-    <w:basedOn w:val="899"/>
+    <w:basedOn w:val="909"/>
     <w:uiPriority w:val="99"/>
     <w:pPr>
       <w:pBdr/>
@@ -13282,9 +13370,9 @@
       </w:tcPr>
     </w:tblStylePr>
   </w:style>
-  <w:style w:type="table" w:styleId="734">
+  <w:style w:type="table" w:styleId="744">
     <w:name w:val="Grid Table 3 - Accent 1"/>
-    <w:basedOn w:val="899"/>
+    <w:basedOn w:val="909"/>
     <w:uiPriority w:val="99"/>
     <w:pPr>
       <w:pBdr/>
@@ -13527,9 +13615,9 @@
       </w:tcPr>
     </w:tblStylePr>
   </w:style>
-  <w:style w:type="table" w:styleId="735">
+  <w:style w:type="table" w:styleId="745">
     <w:name w:val="Grid Table 3 - Accent 2"/>
-    <w:basedOn w:val="899"/>
+    <w:basedOn w:val="909"/>
     <w:uiPriority w:val="99"/>
     <w:pPr>
       <w:pBdr/>
@@ -13772,9 +13860,9 @@
       </w:tcPr>
     </w:tblStylePr>
   </w:style>
-  <w:style w:type="table" w:styleId="736">
+  <w:style w:type="table" w:styleId="746">
     <w:name w:val="Grid Table 3 - Accent 3"/>
-    <w:basedOn w:val="899"/>
+    <w:basedOn w:val="909"/>
     <w:uiPriority w:val="99"/>
     <w:pPr>
       <w:pBdr/>
@@ -14017,9 +14105,9 @@
       </w:tcPr>
     </w:tblStylePr>
   </w:style>
-  <w:style w:type="table" w:styleId="737">
+  <w:style w:type="table" w:styleId="747">
     <w:name w:val="Grid Table 3 - Accent 4"/>
-    <w:basedOn w:val="899"/>
+    <w:basedOn w:val="909"/>
     <w:uiPriority w:val="99"/>
     <w:pPr>
       <w:pBdr/>
@@ -14262,9 +14350,9 @@
       </w:tcPr>
     </w:tblStylePr>
   </w:style>
-  <w:style w:type="table" w:styleId="738">
+  <w:style w:type="table" w:styleId="748">
     <w:name w:val="Grid Table 3 - Accent 5"/>
-    <w:basedOn w:val="899"/>
+    <w:basedOn w:val="909"/>
     <w:uiPriority w:val="99"/>
     <w:pPr>
       <w:pBdr/>
@@ -14507,9 +14595,9 @@
       </w:tcPr>
     </w:tblStylePr>
   </w:style>
-  <w:style w:type="table" w:styleId="739">
+  <w:style w:type="table" w:styleId="749">
     <w:name w:val="Grid Table 3 - Accent 6"/>
-    <w:basedOn w:val="899"/>
+    <w:basedOn w:val="909"/>
     <w:uiPriority w:val="99"/>
     <w:pPr>
       <w:pBdr/>
@@ -14752,9 +14840,9 @@
       </w:tcPr>
     </w:tblStylePr>
   </w:style>
-  <w:style w:type="table" w:styleId="740">
+  <w:style w:type="table" w:styleId="750">
     <w:name w:val="Grid Table 4"/>
-    <w:basedOn w:val="899"/>
+    <w:basedOn w:val="909"/>
     <w:uiPriority w:val="59"/>
     <w:pPr>
       <w:pBdr/>
@@ -14985,9 +15073,9 @@
       </w:tcPr>
     </w:tblStylePr>
   </w:style>
-  <w:style w:type="table" w:styleId="741">
+  <w:style w:type="table" w:styleId="751">
     <w:name w:val="Grid Table 4 - Accent 1"/>
-    <w:basedOn w:val="899"/>
+    <w:basedOn w:val="909"/>
     <w:uiPriority w:val="59"/>
     <w:pPr>
       <w:pBdr/>
@@ -15218,9 +15306,9 @@
       </w:tcPr>
     </w:tblStylePr>
   </w:style>
-  <w:style w:type="table" w:styleId="742">
+  <w:style w:type="table" w:styleId="752">
     <w:name w:val="Grid Table 4 - Accent 2"/>
-    <w:basedOn w:val="899"/>
+    <w:basedOn w:val="909"/>
     <w:uiPriority w:val="59"/>
     <w:pPr>
       <w:pBdr/>
@@ -15451,9 +15539,9 @@
       </w:tcPr>
     </w:tblStylePr>
   </w:style>
-  <w:style w:type="table" w:styleId="743">
+  <w:style w:type="table" w:styleId="753">
     <w:name w:val="Grid Table 4 - Accent 3"/>
-    <w:basedOn w:val="899"/>
+    <w:basedOn w:val="909"/>
     <w:uiPriority w:val="59"/>
     <w:pPr>
       <w:pBdr/>
@@ -15684,9 +15772,9 @@
       </w:tcPr>
     </w:tblStylePr>
   </w:style>
-  <w:style w:type="table" w:styleId="744">
+  <w:style w:type="table" w:styleId="754">
     <w:name w:val="Grid Table 4 - Accent 4"/>
-    <w:basedOn w:val="899"/>
+    <w:basedOn w:val="909"/>
     <w:uiPriority w:val="59"/>
     <w:pPr>
       <w:pBdr/>
@@ -15917,9 +16005,9 @@
       </w:tcPr>
     </w:tblStylePr>
   </w:style>
-  <w:style w:type="table" w:styleId="745">
+  <w:style w:type="table" w:styleId="755">
     <w:name w:val="Grid Table 4 - Accent 5"/>
-    <w:basedOn w:val="899"/>
+    <w:basedOn w:val="909"/>
     <w:uiPriority w:val="59"/>
     <w:pPr>
       <w:pBdr/>
@@ -16150,9 +16238,9 @@
       </w:tcPr>
     </w:tblStylePr>
   </w:style>
-  <w:style w:type="table" w:styleId="746">
+  <w:style w:type="table" w:styleId="756">
     <w:name w:val="Grid Table 4 - Accent 6"/>
-    <w:basedOn w:val="899"/>
+    <w:basedOn w:val="909"/>
     <w:uiPriority w:val="59"/>
     <w:pPr>
       <w:pBdr/>
@@ -16383,9 +16471,9 @@
       </w:tcPr>
     </w:tblStylePr>
   </w:style>
-  <w:style w:type="table" w:styleId="747">
+  <w:style w:type="table" w:styleId="757">
     <w:name w:val="Grid Table 5 Dark"/>
-    <w:basedOn w:val="899"/>
+    <w:basedOn w:val="909"/>
     <w:uiPriority w:val="99"/>
     <w:pPr>
       <w:pBdr/>
@@ -16611,9 +16699,9 @@
       </w:tcPr>
     </w:tblStylePr>
   </w:style>
-  <w:style w:type="table" w:styleId="748">
+  <w:style w:type="table" w:styleId="758">
     <w:name w:val="Grid Table 5 Dark- Accent 1"/>
-    <w:basedOn w:val="899"/>
+    <w:basedOn w:val="909"/>
     <w:uiPriority w:val="99"/>
     <w:pPr>
       <w:pBdr/>
@@ -16839,9 +16927,9 @@
       </w:tcPr>
     </w:tblStylePr>
   </w:style>
-  <w:style w:type="table" w:styleId="749">
+  <w:style w:type="table" w:styleId="759">
     <w:name w:val="Grid Table 5 Dark - Accent 2"/>
-    <w:basedOn w:val="899"/>
+    <w:basedOn w:val="909"/>
     <w:uiPriority w:val="99"/>
     <w:pPr>
       <w:pBdr/>
@@ -17067,9 +17155,9 @@
       </w:tcPr>
     </w:tblStylePr>
   </w:style>
-  <w:style w:type="table" w:styleId="750">
+  <w:style w:type="table" w:styleId="760">
     <w:name w:val="Grid Table 5 Dark - Accent 3"/>
-    <w:basedOn w:val="899"/>
+    <w:basedOn w:val="909"/>
     <w:uiPriority w:val="99"/>
     <w:pPr>
       <w:pBdr/>
@@ -17295,9 +17383,9 @@
       </w:tcPr>
     </w:tblStylePr>
   </w:style>
-  <w:style w:type="table" w:styleId="751">
+  <w:style w:type="table" w:styleId="761">
     <w:name w:val="Grid Table 5 Dark- Accent 4"/>
-    <w:basedOn w:val="899"/>
+    <w:basedOn w:val="909"/>
     <w:uiPriority w:val="99"/>
     <w:pPr>
       <w:pBdr/>
@@ -17523,9 +17611,9 @@
       </w:tcPr>
     </w:tblStylePr>
   </w:style>
-  <w:style w:type="table" w:styleId="752">
+  <w:style w:type="table" w:styleId="762">
     <w:name w:val="Grid Table 5 Dark - Accent 5"/>
-    <w:basedOn w:val="899"/>
+    <w:basedOn w:val="909"/>
     <w:uiPriority w:val="99"/>
     <w:pPr>
       <w:pBdr/>
@@ -17751,9 +17839,9 @@
       </w:tcPr>
     </w:tblStylePr>
   </w:style>
-  <w:style w:type="table" w:styleId="753">
+  <w:style w:type="table" w:styleId="763">
     <w:name w:val="Grid Table 5 Dark - Accent 6"/>
-    <w:basedOn w:val="899"/>
+    <w:basedOn w:val="909"/>
     <w:uiPriority w:val="99"/>
     <w:pPr>
       <w:pBdr/>
@@ -17979,9 +18067,9 @@
       </w:tcPr>
     </w:tblStylePr>
   </w:style>
-  <w:style w:type="table" w:styleId="754">
+  <w:style w:type="table" w:styleId="764">
     <w:name w:val="Grid Table 6 Colorful"/>
-    <w:basedOn w:val="899"/>
+    <w:basedOn w:val="909"/>
     <w:uiPriority w:val="99"/>
     <w:pPr>
       <w:pBdr/>
@@ -18209,9 +18297,9 @@
       </w:tcPr>
     </w:tblStylePr>
   </w:style>
-  <w:style w:type="table" w:styleId="755">
+  <w:style w:type="table" w:styleId="765">
     <w:name w:val="Grid Table 6 Colorful - Accent 1"/>
-    <w:basedOn w:val="899"/>
+    <w:basedOn w:val="909"/>
     <w:uiPriority w:val="99"/>
     <w:pPr>
       <w:pBdr/>
@@ -18439,9 +18527,9 @@
       </w:tcPr>
     </w:tblStylePr>
   </w:style>
-  <w:style w:type="table" w:styleId="756">
+  <w:style w:type="table" w:styleId="766">
     <w:name w:val="Grid Table 6 Colorful - Accent 2"/>
-    <w:basedOn w:val="899"/>
+    <w:basedOn w:val="909"/>
     <w:uiPriority w:val="99"/>
     <w:pPr>
       <w:pBdr/>
@@ -18669,9 +18757,9 @@
       </w:tcPr>
     </w:tblStylePr>
   </w:style>
-  <w:style w:type="table" w:styleId="757">
+  <w:style w:type="table" w:styleId="767">
     <w:name w:val="Grid Table 6 Colorful - Accent 3"/>
-    <w:basedOn w:val="899"/>
+    <w:basedOn w:val="909"/>
     <w:uiPriority w:val="99"/>
     <w:pPr>
       <w:pBdr/>
@@ -18899,9 +18987,9 @@
       </w:tcPr>
     </w:tblStylePr>
   </w:style>
-  <w:style w:type="table" w:styleId="758">
+  <w:style w:type="table" w:styleId="768">
     <w:name w:val="Grid Table 6 Colorful - Accent 4"/>
-    <w:basedOn w:val="899"/>
+    <w:basedOn w:val="909"/>
     <w:uiPriority w:val="99"/>
     <w:pPr>
       <w:pBdr/>
@@ -19129,9 +19217,9 @@
       </w:tcPr>
     </w:tblStylePr>
   </w:style>
-  <w:style w:type="table" w:styleId="759">
+  <w:style w:type="table" w:styleId="769">
     <w:name w:val="Grid Table 6 Colorful - Accent 5"/>
-    <w:basedOn w:val="899"/>
+    <w:basedOn w:val="909"/>
     <w:uiPriority w:val="99"/>
     <w:pPr>
       <w:pBdr/>
@@ -19359,9 +19447,9 @@
       </w:tcPr>
     </w:tblStylePr>
   </w:style>
-  <w:style w:type="table" w:styleId="760">
+  <w:style w:type="table" w:styleId="770">
     <w:name w:val="Grid Table 6 Colorful - Accent 6"/>
-    <w:basedOn w:val="899"/>
+    <w:basedOn w:val="909"/>
     <w:uiPriority w:val="99"/>
     <w:pPr>
       <w:pBdr/>
@@ -19589,9 +19677,9 @@
       </w:tcPr>
     </w:tblStylePr>
   </w:style>
-  <w:style w:type="table" w:styleId="761">
+  <w:style w:type="table" w:styleId="771">
     <w:name w:val="Grid Table 7 Colorful"/>
-    <w:basedOn w:val="899"/>
+    <w:basedOn w:val="909"/>
     <w:uiPriority w:val="99"/>
     <w:pPr>
       <w:pBdr/>
@@ -19843,9 +19931,9 @@
       </w:tcPr>
     </w:tblStylePr>
   </w:style>
-  <w:style w:type="table" w:styleId="762">
+  <w:style w:type="table" w:styleId="772">
     <w:name w:val="Grid Table 7 Colorful - Accent 1"/>
-    <w:basedOn w:val="899"/>
+    <w:basedOn w:val="909"/>
     <w:uiPriority w:val="99"/>
     <w:pPr>
       <w:pBdr/>
@@ -20097,9 +20185,9 @@
       </w:tcPr>
     </w:tblStylePr>
   </w:style>
-  <w:style w:type="table" w:styleId="763">
+  <w:style w:type="table" w:styleId="773">
     <w:name w:val="Grid Table 7 Colorful - Accent 2"/>
-    <w:basedOn w:val="899"/>
+    <w:basedOn w:val="909"/>
     <w:uiPriority w:val="99"/>
     <w:pPr>
       <w:pBdr/>
@@ -20351,9 +20439,9 @@
       </w:tcPr>
     </w:tblStylePr>
   </w:style>
-  <w:style w:type="table" w:styleId="764">
+  <w:style w:type="table" w:styleId="774">
     <w:name w:val="Grid Table 7 Colorful - Accent 3"/>
-    <w:basedOn w:val="899"/>
+    <w:basedOn w:val="909"/>
     <w:uiPriority w:val="99"/>
     <w:pPr>
       <w:pBdr/>
@@ -20605,9 +20693,9 @@
       </w:tcPr>
     </w:tblStylePr>
   </w:style>
-  <w:style w:type="table" w:styleId="765">
+  <w:style w:type="table" w:styleId="775">
     <w:name w:val="Grid Table 7 Colorful - Accent 4"/>
-    <w:basedOn w:val="899"/>
+    <w:basedOn w:val="909"/>
     <w:uiPriority w:val="99"/>
     <w:pPr>
       <w:pBdr/>
@@ -20859,9 +20947,9 @@
       </w:tcPr>
     </w:tblStylePr>
   </w:style>
-  <w:style w:type="table" w:styleId="766">
+  <w:style w:type="table" w:styleId="776">
     <w:name w:val="Grid Table 7 Colorful - Accent 5"/>
-    <w:basedOn w:val="899"/>
+    <w:basedOn w:val="909"/>
     <w:uiPriority w:val="99"/>
     <w:pPr>
       <w:pBdr/>
@@ -21113,9 +21201,9 @@
       </w:tcPr>
     </w:tblStylePr>
   </w:style>
-  <w:style w:type="table" w:styleId="767">
+  <w:style w:type="table" w:styleId="777">
     <w:name w:val="Grid Table 7 Colorful - Accent 6"/>
-    <w:basedOn w:val="899"/>
+    <w:basedOn w:val="909"/>
     <w:uiPriority w:val="99"/>
     <w:pPr>
       <w:pBdr/>
@@ -21367,9 +21455,9 @@
       </w:tcPr>
     </w:tblStylePr>
   </w:style>
-  <w:style w:type="table" w:styleId="768">
+  <w:style w:type="table" w:styleId="778">
     <w:name w:val="List Table 1 Light"/>
-    <w:basedOn w:val="899"/>
+    <w:basedOn w:val="909"/>
     <w:uiPriority w:val="99"/>
     <w:pPr>
       <w:pBdr/>
@@ -21583,9 +21671,9 @@
       </w:tcPr>
     </w:tblStylePr>
   </w:style>
-  <w:style w:type="table" w:styleId="769">
+  <w:style w:type="table" w:styleId="779">
     <w:name w:val="List Table 1 Light - Accent 1"/>
-    <w:basedOn w:val="899"/>
+    <w:basedOn w:val="909"/>
     <w:uiPriority w:val="99"/>
     <w:pPr>
       <w:pBdr/>
@@ -21799,9 +21887,9 @@
       </w:tcPr>
     </w:tblStylePr>
   </w:style>
-  <w:style w:type="table" w:styleId="770">
+  <w:style w:type="table" w:styleId="780">
     <w:name w:val="List Table 1 Light - Accent 2"/>
-    <w:basedOn w:val="899"/>
+    <w:basedOn w:val="909"/>
     <w:uiPriority w:val="99"/>
     <w:pPr>
       <w:pBdr/>
@@ -22015,9 +22103,9 @@
       </w:tcPr>
     </w:tblStylePr>
   </w:style>
-  <w:style w:type="table" w:styleId="771">
+  <w:style w:type="table" w:styleId="781">
     <w:name w:val="List Table 1 Light - Accent 3"/>
-    <w:basedOn w:val="899"/>
+    <w:basedOn w:val="909"/>
     <w:uiPriority w:val="99"/>
     <w:pPr>
       <w:pBdr/>
@@ -22231,9 +22319,9 @@
       </w:tcPr>
     </w:tblStylePr>
   </w:style>
-  <w:style w:type="table" w:styleId="772">
+  <w:style w:type="table" w:styleId="782">
     <w:name w:val="List Table 1 Light - Accent 4"/>
-    <w:basedOn w:val="899"/>
+    <w:basedOn w:val="909"/>
     <w:uiPriority w:val="99"/>
     <w:pPr>
       <w:pBdr/>
@@ -22447,9 +22535,9 @@
       </w:tcPr>
     </w:tblStylePr>
   </w:style>
-  <w:style w:type="table" w:styleId="773">
+  <w:style w:type="table" w:styleId="783">
     <w:name w:val="List Table 1 Light - Accent 5"/>
-    <w:basedOn w:val="899"/>
+    <w:basedOn w:val="909"/>
     <w:uiPriority w:val="99"/>
     <w:pPr>
       <w:pBdr/>
@@ -22663,9 +22751,9 @@
       </w:tcPr>
     </w:tblStylePr>
   </w:style>
-  <w:style w:type="table" w:styleId="774">
+  <w:style w:type="table" w:styleId="784">
     <w:name w:val="List Table 1 Light - Accent 6"/>
-    <w:basedOn w:val="899"/>
+    <w:basedOn w:val="909"/>
     <w:uiPriority w:val="99"/>
     <w:pPr>
       <w:pBdr/>
@@ -22879,9 +22967,9 @@
       </w:tcPr>
     </w:tblStylePr>
   </w:style>
-  <w:style w:type="table" w:styleId="775">
+  <w:style w:type="table" w:styleId="785">
     <w:name w:val="List Table 2"/>
-    <w:basedOn w:val="899"/>
+    <w:basedOn w:val="909"/>
     <w:uiPriority w:val="99"/>
     <w:pPr>
       <w:pBdr/>
@@ -23117,9 +23205,9 @@
       </w:tcPr>
     </w:tblStylePr>
   </w:style>
-  <w:style w:type="table" w:styleId="776">
+  <w:style w:type="table" w:styleId="786">
     <w:name w:val="List Table 2 - Accent 1"/>
-    <w:basedOn w:val="899"/>
+    <w:basedOn w:val="909"/>
     <w:uiPriority w:val="99"/>
     <w:pPr>
       <w:pBdr/>
@@ -23355,9 +23443,9 @@
       </w:tcPr>
     </w:tblStylePr>
   </w:style>
-  <w:style w:type="table" w:styleId="777">
+  <w:style w:type="table" w:styleId="787">
     <w:name w:val="List Table 2 - Accent 2"/>
-    <w:basedOn w:val="899"/>
+    <w:basedOn w:val="909"/>
     <w:uiPriority w:val="99"/>
     <w:pPr>
       <w:pBdr/>
@@ -23593,9 +23681,9 @@
       </w:tcPr>
     </w:tblStylePr>
   </w:style>
-  <w:style w:type="table" w:styleId="778">
+  <w:style w:type="table" w:styleId="788">
     <w:name w:val="List Table 2 - Accent 3"/>
-    <w:basedOn w:val="899"/>
+    <w:basedOn w:val="909"/>
     <w:uiPriority w:val="99"/>
     <w:pPr>
       <w:pBdr/>
@@ -23831,9 +23919,9 @@
       </w:tcPr>
     </w:tblStylePr>
   </w:style>
-  <w:style w:type="table" w:styleId="779">
+  <w:style w:type="table" w:styleId="789">
     <w:name w:val="List Table 2 - Accent 4"/>
-    <w:basedOn w:val="899"/>
+    <w:basedOn w:val="909"/>
     <w:uiPriority w:val="99"/>
     <w:pPr>
       <w:pBdr/>
@@ -24069,9 +24157,9 @@
       </w:tcPr>
     </w:tblStylePr>
   </w:style>
-  <w:style w:type="table" w:styleId="780">
+  <w:style w:type="table" w:styleId="790">
     <w:name w:val="List Table 2 - Accent 5"/>
-    <w:basedOn w:val="899"/>
+    <w:basedOn w:val="909"/>
     <w:uiPriority w:val="99"/>
     <w:pPr>
       <w:pBdr/>
@@ -24307,9 +24395,9 @@
       </w:tcPr>
     </w:tblStylePr>
   </w:style>
-  <w:style w:type="table" w:styleId="781">
+  <w:style w:type="table" w:styleId="791">
     <w:name w:val="List Table 2 - Accent 6"/>
-    <w:basedOn w:val="899"/>
+    <w:basedOn w:val="909"/>
     <w:uiPriority w:val="99"/>
     <w:pPr>
       <w:pBdr/>
@@ -24545,9 +24633,9 @@
       </w:tcPr>
     </w:tblStylePr>
   </w:style>
-  <w:style w:type="table" w:styleId="782">
+  <w:style w:type="table" w:styleId="792">
     <w:name w:val="List Table 3"/>
-    <w:basedOn w:val="899"/>
+    <w:basedOn w:val="909"/>
     <w:uiPriority w:val="99"/>
     <w:pPr>
       <w:pBdr/>
@@ -24773,9 +24861,9 @@
       </w:tcPr>
     </w:tblStylePr>
   </w:style>
-  <w:style w:type="table" w:styleId="783">
+  <w:style w:type="table" w:styleId="793">
     <w:name w:val="List Table 3 - Accent 1"/>
-    <w:basedOn w:val="899"/>
+    <w:basedOn w:val="909"/>
     <w:uiPriority w:val="99"/>
     <w:pPr>
       <w:pBdr/>
@@ -25001,9 +25089,9 @@
       </w:tcPr>
     </w:tblStylePr>
   </w:style>
-  <w:style w:type="table" w:styleId="784">
+  <w:style w:type="table" w:styleId="794">
     <w:name w:val="List Table 3 - Accent 2"/>
-    <w:basedOn w:val="899"/>
+    <w:basedOn w:val="909"/>
     <w:uiPriority w:val="99"/>
     <w:pPr>
       <w:pBdr/>
@@ -25229,9 +25317,9 @@
       </w:tcPr>
     </w:tblStylePr>
   </w:style>
-  <w:style w:type="table" w:styleId="785">
+  <w:style w:type="table" w:styleId="795">
     <w:name w:val="List Table 3 - Accent 3"/>
-    <w:basedOn w:val="899"/>
+    <w:basedOn w:val="909"/>
     <w:uiPriority w:val="99"/>
     <w:pPr>
       <w:pBdr/>
@@ -25457,9 +25545,9 @@
       </w:tcPr>
     </w:tblStylePr>
   </w:style>
-  <w:style w:type="table" w:styleId="786">
+  <w:style w:type="table" w:styleId="796">
     <w:name w:val="List Table 3 - Accent 4"/>
-    <w:basedOn w:val="899"/>
+    <w:basedOn w:val="909"/>
     <w:uiPriority w:val="99"/>
     <w:pPr>
       <w:pBdr/>
@@ -25685,9 +25773,9 @@
       </w:tcPr>
     </w:tblStylePr>
   </w:style>
-  <w:style w:type="table" w:styleId="787">
+  <w:style w:type="table" w:styleId="797">
     <w:name w:val="List Table 3 - Accent 5"/>
-    <w:basedOn w:val="899"/>
+    <w:basedOn w:val="909"/>
     <w:uiPriority w:val="99"/>
     <w:pPr>
       <w:pBdr/>
@@ -25913,9 +26001,9 @@
       </w:tcPr>
     </w:tblStylePr>
   </w:style>
-  <w:style w:type="table" w:styleId="788">
+  <w:style w:type="table" w:styleId="798">
     <w:name w:val="List Table 3 - Accent 6"/>
-    <w:basedOn w:val="899"/>
+    <w:basedOn w:val="909"/>
     <w:uiPriority w:val="99"/>
     <w:pPr>
       <w:pBdr/>
@@ -26141,9 +26229,9 @@
       </w:tcPr>
     </w:tblStylePr>
   </w:style>
-  <w:style w:type="table" w:styleId="789">
+  <w:style w:type="table" w:styleId="799">
     <w:name w:val="List Table 4"/>
-    <w:basedOn w:val="899"/>
+    <w:basedOn w:val="909"/>
     <w:uiPriority w:val="99"/>
     <w:pPr>
       <w:pBdr/>
@@ -26366,9 +26454,9 @@
       </w:tcPr>
     </w:tblStylePr>
   </w:style>
-  <w:style w:type="table" w:styleId="790">
+  <w:style w:type="table" w:styleId="800">
     <w:name w:val="List Table 4 - Accent 1"/>
-    <w:basedOn w:val="899"/>
+    <w:basedOn w:val="909"/>
     <w:uiPriority w:val="99"/>
     <w:pPr>
       <w:pBdr/>
@@ -26591,9 +26679,9 @@
       </w:tcPr>
     </w:tblStylePr>
   </w:style>
-  <w:style w:type="table" w:styleId="791">
+  <w:style w:type="table" w:styleId="801">
     <w:name w:val="List Table 4 - Accent 2"/>
-    <w:basedOn w:val="899"/>
+    <w:basedOn w:val="909"/>
     <w:uiPriority w:val="99"/>
     <w:pPr>
       <w:pBdr/>
@@ -26816,9 +26904,9 @@
       </w:tcPr>
     </w:tblStylePr>
   </w:style>
-  <w:style w:type="table" w:styleId="792">
+  <w:style w:type="table" w:styleId="802">
     <w:name w:val="List Table 4 - Accent 3"/>
-    <w:basedOn w:val="899"/>
+    <w:basedOn w:val="909"/>
     <w:uiPriority w:val="99"/>
     <w:pPr>
       <w:pBdr/>
@@ -27041,9 +27129,9 @@
       </w:tcPr>
     </w:tblStylePr>
   </w:style>
-  <w:style w:type="table" w:styleId="793">
+  <w:style w:type="table" w:styleId="803">
     <w:name w:val="List Table 4 - Accent 4"/>
-    <w:basedOn w:val="899"/>
+    <w:basedOn w:val="909"/>
     <w:uiPriority w:val="99"/>
     <w:pPr>
       <w:pBdr/>
@@ -27266,9 +27354,9 @@
       </w:tcPr>
     </w:tblStylePr>
   </w:style>
-  <w:style w:type="table" w:styleId="794">
+  <w:style w:type="table" w:styleId="804">
     <w:name w:val="List Table 4 - Accent 5"/>
-    <w:basedOn w:val="899"/>
+    <w:basedOn w:val="909"/>
     <w:uiPriority w:val="99"/>
     <w:pPr>
       <w:pBdr/>
@@ -27491,9 +27579,9 @@
       </w:tcPr>
     </w:tblStylePr>
   </w:style>
-  <w:style w:type="table" w:styleId="795">
+  <w:style w:type="table" w:styleId="805">
     <w:name w:val="List Table 4 - Accent 6"/>
-    <w:basedOn w:val="899"/>
+    <w:basedOn w:val="909"/>
     <w:uiPriority w:val="99"/>
     <w:pPr>
       <w:pBdr/>
@@ -27716,9 +27804,9 @@
       </w:tcPr>
     </w:tblStylePr>
   </w:style>
-  <w:style w:type="table" w:styleId="796">
+  <w:style w:type="table" w:styleId="806">
     <w:name w:val="List Table 5 Dark"/>
-    <w:basedOn w:val="899"/>
+    <w:basedOn w:val="909"/>
     <w:uiPriority w:val="99"/>
     <w:pPr>
       <w:pBdr/>
@@ -27958,9 +28046,9 @@
       </w:tcPr>
     </w:tblStylePr>
   </w:style>
-  <w:style w:type="table" w:styleId="797">
+  <w:style w:type="table" w:styleId="807">
     <w:name w:val="List Table 5 Dark - Accent 1"/>
-    <w:basedOn w:val="899"/>
+    <w:basedOn w:val="909"/>
     <w:uiPriority w:val="99"/>
     <w:pPr>
       <w:pBdr/>
@@ -28200,9 +28288,9 @@
       </w:tcPr>
     </w:tblStylePr>
   </w:style>
-  <w:style w:type="table" w:styleId="798">
+  <w:style w:type="table" w:styleId="808">
     <w:name w:val="List Table 5 Dark - Accent 2"/>
-    <w:basedOn w:val="899"/>
+    <w:basedOn w:val="909"/>
     <w:uiPriority w:val="99"/>
     <w:pPr>
       <w:pBdr/>
@@ -28442,9 +28530,9 @@
       </w:tcPr>
     </w:tblStylePr>
   </w:style>
-  <w:style w:type="table" w:styleId="799">
+  <w:style w:type="table" w:styleId="809">
     <w:name w:val="List Table 5 Dark - Accent 3"/>
-    <w:basedOn w:val="899"/>
+    <w:basedOn w:val="909"/>
     <w:uiPriority w:val="99"/>
     <w:pPr>
       <w:pBdr/>
@@ -28684,9 +28772,9 @@
       </w:tcPr>
     </w:tblStylePr>
   </w:style>
-  <w:style w:type="table" w:styleId="800">
+  <w:style w:type="table" w:styleId="810">
     <w:name w:val="List Table 5 Dark - Accent 4"/>
-    <w:basedOn w:val="899"/>
+    <w:basedOn w:val="909"/>
     <w:uiPriority w:val="99"/>
     <w:pPr>
       <w:pBdr/>
@@ -28926,9 +29014,9 @@
       </w:tcPr>
     </w:tblStylePr>
   </w:style>
-  <w:style w:type="table" w:styleId="801">
+  <w:style w:type="table" w:styleId="811">
     <w:name w:val="List Table 5 Dark - Accent 5"/>
-    <w:basedOn w:val="899"/>
+    <w:basedOn w:val="909"/>
     <w:uiPriority w:val="99"/>
     <w:pPr>
       <w:pBdr/>
@@ -29168,9 +29256,9 @@
       </w:tcPr>
     </w:tblStylePr>
   </w:style>
-  <w:style w:type="table" w:styleId="802">
+  <w:style w:type="table" w:styleId="812">
     <w:name w:val="List Table 5 Dark - Accent 6"/>
-    <w:basedOn w:val="899"/>
+    <w:basedOn w:val="909"/>
     <w:uiPriority w:val="99"/>
     <w:pPr>
       <w:pBdr/>
@@ -29410,9 +29498,9 @@
       </w:tcPr>
     </w:tblStylePr>
   </w:style>
-  <w:style w:type="table" w:styleId="803">
+  <w:style w:type="table" w:styleId="813">
     <w:name w:val="List Table 6 Colorful"/>
-    <w:basedOn w:val="899"/>
+    <w:basedOn w:val="909"/>
     <w:uiPriority w:val="99"/>
     <w:pPr>
       <w:pBdr/>
@@ -29633,9 +29721,9 @@
       </w:tcPr>
     </w:tblStylePr>
   </w:style>
-  <w:style w:type="table" w:styleId="804">
+  <w:style w:type="table" w:styleId="814">
     <w:name w:val="List Table 6 Colorful - Accent 1"/>
-    <w:basedOn w:val="899"/>
+    <w:basedOn w:val="909"/>
     <w:uiPriority w:val="99"/>
     <w:pPr>
       <w:pBdr/>
@@ -29856,9 +29944,9 @@
       </w:tcPr>
     </w:tblStylePr>
   </w:style>
-  <w:style w:type="table" w:styleId="805">
+  <w:style w:type="table" w:styleId="815">
     <w:name w:val="List Table 6 Colorful - Accent 2"/>
-    <w:basedOn w:val="899"/>
+    <w:basedOn w:val="909"/>
     <w:uiPriority w:val="99"/>
     <w:pPr>
       <w:pBdr/>
@@ -30079,9 +30167,9 @@
       </w:tcPr>
     </w:tblStylePr>
   </w:style>
-  <w:style w:type="table" w:styleId="806">
+  <w:style w:type="table" w:styleId="816">
     <w:name w:val="List Table 6 Colorful - Accent 3"/>
-    <w:basedOn w:val="899"/>
+    <w:basedOn w:val="909"/>
     <w:uiPriority w:val="99"/>
     <w:pPr>
       <w:pBdr/>
@@ -30302,9 +30390,9 @@
       </w:tcPr>
     </w:tblStylePr>
   </w:style>
-  <w:style w:type="table" w:styleId="807">
+  <w:style w:type="table" w:styleId="817">
     <w:name w:val="List Table 6 Colorful - Accent 4"/>
-    <w:basedOn w:val="899"/>
+    <w:basedOn w:val="909"/>
     <w:uiPriority w:val="99"/>
     <w:pPr>
       <w:pBdr/>
@@ -30525,9 +30613,9 @@
       </w:tcPr>
     </w:tblStylePr>
   </w:style>
-  <w:style w:type="table" w:styleId="808">
+  <w:style w:type="table" w:styleId="818">
     <w:name w:val="List Table 6 Colorful - Accent 5"/>
-    <w:basedOn w:val="899"/>
+    <w:basedOn w:val="909"/>
     <w:uiPriority w:val="99"/>
     <w:pPr>
       <w:pBdr/>
@@ -30748,9 +30836,9 @@
       </w:tcPr>
     </w:tblStylePr>
   </w:style>
-  <w:style w:type="table" w:styleId="809">
+  <w:style w:type="table" w:styleId="819">
     <w:name w:val="List Table 6 Colorful - Accent 6"/>
-    <w:basedOn w:val="899"/>
+    <w:basedOn w:val="909"/>
     <w:uiPriority w:val="99"/>
     <w:pPr>
       <w:pBdr/>
@@ -30971,9 +31059,9 @@
       </w:tcPr>
     </w:tblStylePr>
   </w:style>
-  <w:style w:type="table" w:styleId="810">
+  <w:style w:type="table" w:styleId="820">
     <w:name w:val="List Table 7 Colorful"/>
-    <w:basedOn w:val="899"/>
+    <w:basedOn w:val="909"/>
     <w:uiPriority w:val="99"/>
     <w:pPr>
       <w:pBdr/>
@@ -31227,9 +31315,9 @@
       </w:tcPr>
     </w:tblStylePr>
   </w:style>
-  <w:style w:type="table" w:styleId="811">
+  <w:style w:type="table" w:styleId="821">
     <w:name w:val="List Table 7 Colorful - Accent 1"/>
-    <w:basedOn w:val="899"/>
+    <w:basedOn w:val="909"/>
     <w:uiPriority w:val="99"/>
     <w:pPr>
       <w:pBdr/>
@@ -31483,9 +31571,9 @@
       </w:tcPr>
     </w:tblStylePr>
   </w:style>
-  <w:style w:type="table" w:styleId="812">
+  <w:style w:type="table" w:styleId="822">
     <w:name w:val="List Table 7 Colorful - Accent 2"/>
-    <w:basedOn w:val="899"/>
+    <w:basedOn w:val="909"/>
     <w:uiPriority w:val="99"/>
     <w:pPr>
       <w:pBdr/>
@@ -31739,9 +31827,9 @@
       </w:tcPr>
     </w:tblStylePr>
   </w:style>
-  <w:style w:type="table" w:styleId="813">
+  <w:style w:type="table" w:styleId="823">
     <w:name w:val="List Table 7 Colorful - Accent 3"/>
-    <w:basedOn w:val="899"/>
+    <w:basedOn w:val="909"/>
     <w:uiPriority w:val="99"/>
     <w:pPr>
       <w:pBdr/>
@@ -31995,9 +32083,9 @@
       </w:tcPr>
     </w:tblStylePr>
   </w:style>
-  <w:style w:type="table" w:styleId="814">
+  <w:style w:type="table" w:styleId="824">
     <w:name w:val="List Table 7 Colorful - Accent 4"/>
-    <w:basedOn w:val="899"/>
+    <w:basedOn w:val="909"/>
     <w:uiPriority w:val="99"/>
     <w:pPr>
       <w:pBdr/>
@@ -32251,9 +32339,9 @@
       </w:tcPr>
     </w:tblStylePr>
   </w:style>
-  <w:style w:type="table" w:styleId="815">
+  <w:style w:type="table" w:styleId="825">
     <w:name w:val="List Table 7 Colorful - Accent 5"/>
-    <w:basedOn w:val="899"/>
+    <w:basedOn w:val="909"/>
     <w:uiPriority w:val="99"/>
     <w:pPr>
       <w:pBdr/>
@@ -32507,9 +32595,9 @@
       </w:tcPr>
     </w:tblStylePr>
   </w:style>
-  <w:style w:type="table" w:styleId="816">
+  <w:style w:type="table" w:styleId="826">
     <w:name w:val="List Table 7 Colorful - Accent 6"/>
-    <w:basedOn w:val="899"/>
+    <w:basedOn w:val="909"/>
     <w:uiPriority w:val="99"/>
     <w:pPr>
       <w:pBdr/>
@@ -32763,9 +32851,9 @@
       </w:tcPr>
     </w:tblStylePr>
   </w:style>
-  <w:style w:type="table" w:styleId="817">
+  <w:style w:type="table" w:styleId="827">
     <w:name w:val="Lined - Accent"/>
-    <w:basedOn w:val="899"/>
+    <w:basedOn w:val="909"/>
     <w:uiPriority w:val="99"/>
     <w:pPr>
       <w:pBdr/>
@@ -33000,9 +33088,9 @@
       </w:tcPr>
     </w:tblStylePr>
   </w:style>
-  <w:style w:type="table" w:styleId="818">
+  <w:style w:type="table" w:styleId="828">
     <w:name w:val="Lined - Accent 1"/>
-    <w:basedOn w:val="899"/>
+    <w:basedOn w:val="909"/>
     <w:uiPriority w:val="99"/>
     <w:pPr>
       <w:pBdr/>
@@ -33237,9 +33325,9 @@
       </w:tcPr>
     </w:tblStylePr>
   </w:style>
-  <w:style w:type="table" w:styleId="819">
+  <w:style w:type="table" w:styleId="829">
     <w:name w:val="Lined - Accent 2"/>
-    <w:basedOn w:val="899"/>
+    <w:basedOn w:val="909"/>
     <w:uiPriority w:val="99"/>
     <w:pPr>
       <w:pBdr/>
@@ -33474,9 +33562,9 @@
       </w:tcPr>
     </w:tblStylePr>
   </w:style>
-  <w:style w:type="table" w:styleId="820">
+  <w:style w:type="table" w:styleId="830">
     <w:name w:val="Lined - Accent 3"/>
-    <w:basedOn w:val="899"/>
+    <w:basedOn w:val="909"/>
     <w:uiPriority w:val="99"/>
     <w:pPr>
       <w:pBdr/>
@@ -33711,9 +33799,9 @@
       </w:tcPr>
     </w:tblStylePr>
   </w:style>
-  <w:style w:type="table" w:styleId="821">
+  <w:style w:type="table" w:styleId="831">
     <w:name w:val="Lined - Accent 4"/>
-    <w:basedOn w:val="899"/>
+    <w:basedOn w:val="909"/>
     <w:uiPriority w:val="99"/>
     <w:pPr>
       <w:pBdr/>
@@ -33948,9 +34036,9 @@
       </w:tcPr>
     </w:tblStylePr>
   </w:style>
-  <w:style w:type="table" w:styleId="822">
+  <w:style w:type="table" w:styleId="832">
     <w:name w:val="Lined - Accent 5"/>
-    <w:basedOn w:val="899"/>
+    <w:basedOn w:val="909"/>
     <w:uiPriority w:val="99"/>
     <w:pPr>
       <w:pBdr/>
@@ -34185,9 +34273,9 @@
       </w:tcPr>
     </w:tblStylePr>
   </w:style>
-  <w:style w:type="table" w:styleId="823">
+  <w:style w:type="table" w:styleId="833">
     <w:name w:val="Lined - Accent 6"/>
-    <w:basedOn w:val="899"/>
+    <w:basedOn w:val="909"/>
     <w:uiPriority w:val="99"/>
     <w:pPr>
       <w:pBdr/>
@@ -34422,9 +34510,9 @@
       </w:tcPr>
     </w:tblStylePr>
   </w:style>
-  <w:style w:type="table" w:styleId="824">
+  <w:style w:type="table" w:styleId="834">
     <w:name w:val="Bordered &amp; Lined - Accent"/>
-    <w:basedOn w:val="899"/>
+    <w:basedOn w:val="909"/>
     <w:uiPriority w:val="99"/>
     <w:pPr>
       <w:pBdr/>
@@ -34666,9 +34754,9 @@
       </w:tcPr>
     </w:tblStylePr>
   </w:style>
-  <w:style w:type="table" w:styleId="825">
+  <w:style w:type="table" w:styleId="835">
     <w:name w:val="Bordered &amp; Lined - Accent 1"/>
-    <w:basedOn w:val="899"/>
+    <w:basedOn w:val="909"/>
     <w:uiPriority w:val="99"/>
     <w:pPr>
       <w:pBdr/>
@@ -34910,9 +34998,9 @@
       </w:tcPr>
     </w:tblStylePr>
   </w:style>
-  <w:style w:type="table" w:styleId="826">
+  <w:style w:type="table" w:styleId="836">
     <w:name w:val="Bordered &amp; Lined - Accent 2"/>
-    <w:basedOn w:val="899"/>
+    <w:basedOn w:val="909"/>
     <w:uiPriority w:val="99"/>
     <w:pPr>
       <w:pBdr/>
@@ -35154,9 +35242,9 @@
       </w:tcPr>
     </w:tblStylePr>
   </w:style>
-  <w:style w:type="table" w:styleId="827">
+  <w:style w:type="table" w:styleId="837">
     <w:name w:val="Bordered &amp; Lined - Accent 3"/>
-    <w:basedOn w:val="899"/>
+    <w:basedOn w:val="909"/>
     <w:uiPriority w:val="99"/>
     <w:pPr>
       <w:pBdr/>
@@ -35398,9 +35486,9 @@
       </w:tcPr>
     </w:tblStylePr>
   </w:style>
-  <w:style w:type="table" w:styleId="828">
+  <w:style w:type="table" w:styleId="838">
     <w:name w:val="Bordered &amp; Lined - Accent 4"/>
-    <w:basedOn w:val="899"/>
+    <w:basedOn w:val="909"/>
     <w:uiPriority w:val="99"/>
     <w:pPr>
       <w:pBdr/>
@@ -35642,9 +35730,9 @@
       </w:tcPr>
     </w:tblStylePr>
   </w:style>
-  <w:style w:type="table" w:styleId="829">
+  <w:style w:type="table" w:styleId="839">
     <w:name w:val="Bordered &amp; Lined - Accent 5"/>
-    <w:basedOn w:val="899"/>
+    <w:basedOn w:val="909"/>
     <w:uiPriority w:val="99"/>
     <w:pPr>
       <w:pBdr/>
@@ -35886,9 +35974,9 @@
       </w:tcPr>
     </w:tblStylePr>
   </w:style>
-  <w:style w:type="table" w:styleId="830">
+  <w:style w:type="table" w:styleId="840">
     <w:name w:val="Bordered &amp; Lined - Accent 6"/>
-    <w:basedOn w:val="899"/>
+    <w:basedOn w:val="909"/>
     <w:uiPriority w:val="99"/>
     <w:pPr>
       <w:pBdr/>
@@ -36130,9 +36218,9 @@
       </w:tcPr>
     </w:tblStylePr>
   </w:style>
-  <w:style w:type="table" w:styleId="831">
+  <w:style w:type="table" w:styleId="841">
     <w:name w:val="Bordered"/>
-    <w:basedOn w:val="899"/>
+    <w:basedOn w:val="909"/>
     <w:uiPriority w:val="99"/>
     <w:pPr>
       <w:pBdr/>
@@ -36361,9 +36449,9 @@
       </w:tcPr>
     </w:tblStylePr>
   </w:style>
-  <w:style w:type="table" w:styleId="832">
+  <w:style w:type="table" w:styleId="842">
     <w:name w:val="Bordered - Accent 1"/>
-    <w:basedOn w:val="899"/>
+    <w:basedOn w:val="909"/>
     <w:uiPriority w:val="99"/>
     <w:pPr>
       <w:pBdr/>
@@ -36592,9 +36680,9 @@
       </w:tcPr>
     </w:tblStylePr>
   </w:style>
-  <w:style w:type="table" w:styleId="833">
+  <w:style w:type="table" w:styleId="843">
     <w:name w:val="Bordered - Accent 2"/>
-    <w:basedOn w:val="899"/>
+    <w:basedOn w:val="909"/>
     <w:uiPriority w:val="99"/>
     <w:pPr>
       <w:pBdr/>
@@ -36823,9 +36911,9 @@
       </w:tcPr>
     </w:tblStylePr>
   </w:style>
-  <w:style w:type="table" w:styleId="834">
+  <w:style w:type="table" w:styleId="844">
     <w:name w:val="Bordered - Accent 3"/>
-    <w:basedOn w:val="899"/>
+    <w:basedOn w:val="909"/>
     <w:uiPriority w:val="99"/>
     <w:pPr>
       <w:pBdr/>
@@ -37054,9 +37142,9 @@
       </w:tcPr>
     </w:tblStylePr>
   </w:style>
-  <w:style w:type="table" w:styleId="835">
+  <w:style w:type="table" w:styleId="845">
     <w:name w:val="Bordered - Accent 4"/>
-    <w:basedOn w:val="899"/>
+    <w:basedOn w:val="909"/>
     <w:uiPriority w:val="99"/>
     <w:pPr>
       <w:pBdr/>
@@ -37285,9 +37373,9 @@
       </w:tcPr>
     </w:tblStylePr>
   </w:style>
-  <w:style w:type="table" w:styleId="836">
+  <w:style w:type="table" w:styleId="846">
     <w:name w:val="Bordered - Accent 5"/>
-    <w:basedOn w:val="899"/>
+    <w:basedOn w:val="909"/>
     <w:uiPriority w:val="99"/>
     <w:pPr>
       <w:pBdr/>
@@ -37516,9 +37604,9 @@
       </w:tcPr>
     </w:tblStylePr>
   </w:style>
-  <w:style w:type="table" w:styleId="837">
+  <w:style w:type="table" w:styleId="847">
     <w:name w:val="Bordered - Accent 6"/>
-    <w:basedOn w:val="899"/>
+    <w:basedOn w:val="909"/>
     <w:uiPriority w:val="99"/>
     <w:pPr>
       <w:pBdr/>
@@ -37747,11 +37835,11 @@
       </w:tcPr>
     </w:tblStylePr>
   </w:style>
-  <w:style w:type="paragraph" w:styleId="838">
+  <w:style w:type="paragraph" w:styleId="848">
     <w:name w:val="Heading 1"/>
-    <w:basedOn w:val="897"/>
-    <w:next w:val="897"/>
-    <w:link w:val="847"/>
+    <w:basedOn w:val="907"/>
+    <w:next w:val="907"/>
+    <w:link w:val="857"/>
     <w:uiPriority w:val="9"/>
     <w:qFormat/>
     <w:pPr>
@@ -37769,11 +37857,11 @@
       <w:szCs w:val="40"/>
     </w:rPr>
   </w:style>
-  <w:style w:type="paragraph" w:styleId="839">
+  <w:style w:type="paragraph" w:styleId="849">
     <w:name w:val="Heading 2"/>
-    <w:basedOn w:val="897"/>
-    <w:next w:val="897"/>
-    <w:link w:val="848"/>
+    <w:basedOn w:val="907"/>
+    <w:next w:val="907"/>
+    <w:link w:val="858"/>
     <w:uiPriority w:val="9"/>
     <w:unhideWhenUsed/>
     <w:qFormat/>
@@ -37792,11 +37880,11 @@
       <w:szCs w:val="32"/>
     </w:rPr>
   </w:style>
-  <w:style w:type="paragraph" w:styleId="840">
+  <w:style w:type="paragraph" w:styleId="850">
     <w:name w:val="Heading 3"/>
-    <w:basedOn w:val="897"/>
-    <w:next w:val="897"/>
-    <w:link w:val="849"/>
+    <w:basedOn w:val="907"/>
+    <w:next w:val="907"/>
+    <w:link w:val="859"/>
     <w:uiPriority w:val="9"/>
     <w:unhideWhenUsed/>
     <w:qFormat/>
@@ -37815,11 +37903,11 @@
       <w:szCs w:val="28"/>
     </w:rPr>
   </w:style>
-  <w:style w:type="paragraph" w:styleId="841">
+  <w:style w:type="paragraph" w:styleId="851">
     <w:name w:val="Heading 4"/>
-    <w:basedOn w:val="897"/>
-    <w:next w:val="897"/>
-    <w:link w:val="850"/>
+    <w:basedOn w:val="907"/>
+    <w:next w:val="907"/>
+    <w:link w:val="860"/>
     <w:uiPriority w:val="9"/>
     <w:unhideWhenUsed/>
     <w:qFormat/>
@@ -37838,11 +37926,11 @@
       <w:color w:val="0f4761" w:themeColor="accent1" w:themeShade="BF"/>
     </w:rPr>
   </w:style>
-  <w:style w:type="paragraph" w:styleId="842">
+  <w:style w:type="paragraph" w:styleId="852">
     <w:name w:val="Heading 5"/>
-    <w:basedOn w:val="897"/>
-    <w:next w:val="897"/>
-    <w:link w:val="851"/>
+    <w:basedOn w:val="907"/>
+    <w:next w:val="907"/>
+    <w:link w:val="861"/>
     <w:uiPriority w:val="9"/>
     <w:unhideWhenUsed/>
     <w:qFormat/>
@@ -37859,11 +37947,11 @@
       <w:color w:val="0f4761" w:themeColor="accent1" w:themeShade="BF"/>
     </w:rPr>
   </w:style>
-  <w:style w:type="paragraph" w:styleId="843">
+  <w:style w:type="paragraph" w:styleId="853">
     <w:name w:val="Heading 6"/>
-    <w:basedOn w:val="897"/>
-    <w:next w:val="897"/>
-    <w:link w:val="852"/>
+    <w:basedOn w:val="907"/>
+    <w:next w:val="907"/>
+    <w:link w:val="862"/>
     <w:uiPriority w:val="9"/>
     <w:unhideWhenUsed/>
     <w:qFormat/>
@@ -37882,11 +37970,11 @@
       <w:color w:val="595959" w:themeColor="text1" w:themeTint="A6"/>
     </w:rPr>
   </w:style>
-  <w:style w:type="paragraph" w:styleId="844">
+  <w:style w:type="paragraph" w:styleId="854">
     <w:name w:val="Heading 7"/>
-    <w:basedOn w:val="897"/>
-    <w:next w:val="897"/>
-    <w:link w:val="853"/>
+    <w:basedOn w:val="907"/>
+    <w:next w:val="907"/>
+    <w:link w:val="863"/>
     <w:uiPriority w:val="9"/>
     <w:unhideWhenUsed/>
     <w:qFormat/>
@@ -37903,11 +37991,11 @@
       <w:color w:val="595959" w:themeColor="text1" w:themeTint="A6"/>
     </w:rPr>
   </w:style>
-  <w:style w:type="paragraph" w:styleId="845">
+  <w:style w:type="paragraph" w:styleId="855">
     <w:name w:val="Heading 8"/>
-    <w:basedOn w:val="897"/>
-    <w:next w:val="897"/>
-    <w:link w:val="854"/>
+    <w:basedOn w:val="907"/>
+    <w:next w:val="907"/>
+    <w:link w:val="864"/>
     <w:uiPriority w:val="9"/>
     <w:unhideWhenUsed/>
     <w:qFormat/>
@@ -37926,11 +38014,11 @@
       <w:color w:val="272727" w:themeColor="text1" w:themeTint="D8"/>
     </w:rPr>
   </w:style>
-  <w:style w:type="paragraph" w:styleId="846">
+  <w:style w:type="paragraph" w:styleId="856">
     <w:name w:val="Heading 9"/>
-    <w:basedOn w:val="897"/>
-    <w:next w:val="897"/>
-    <w:link w:val="855"/>
+    <w:basedOn w:val="907"/>
+    <w:next w:val="907"/>
+    <w:link w:val="865"/>
     <w:uiPriority w:val="9"/>
     <w:unhideWhenUsed/>
     <w:qFormat/>
@@ -37949,10 +38037,10 @@
       <w:color w:val="272727" w:themeColor="text1" w:themeTint="D8"/>
     </w:rPr>
   </w:style>
-  <w:style w:type="character" w:styleId="847">
+  <w:style w:type="character" w:styleId="857">
     <w:name w:val="Heading 1 Char"/>
-    <w:basedOn w:val="898"/>
-    <w:link w:val="838"/>
+    <w:basedOn w:val="908"/>
+    <w:link w:val="848"/>
     <w:uiPriority w:val="9"/>
     <w:pPr>
       <w:pBdr/>
@@ -37966,10 +38054,10 @@
       <w:szCs w:val="40"/>
     </w:rPr>
   </w:style>
-  <w:style w:type="character" w:styleId="848">
+  <w:style w:type="character" w:styleId="858">
     <w:name w:val="Heading 2 Char"/>
-    <w:basedOn w:val="898"/>
-    <w:link w:val="839"/>
+    <w:basedOn w:val="908"/>
+    <w:link w:val="849"/>
     <w:uiPriority w:val="9"/>
     <w:pPr>
       <w:pBdr/>
@@ -37983,10 +38071,10 @@
       <w:szCs w:val="32"/>
     </w:rPr>
   </w:style>
-  <w:style w:type="character" w:styleId="849">
+  <w:style w:type="character" w:styleId="859">
     <w:name w:val="Heading 3 Char"/>
-    <w:basedOn w:val="898"/>
-    <w:link w:val="840"/>
+    <w:basedOn w:val="908"/>
+    <w:link w:val="850"/>
     <w:uiPriority w:val="9"/>
     <w:pPr>
       <w:pBdr/>
@@ -38000,10 +38088,10 @@
       <w:szCs w:val="28"/>
     </w:rPr>
   </w:style>
-  <w:style w:type="character" w:styleId="850">
+  <w:style w:type="character" w:styleId="860">
     <w:name w:val="Heading 4 Char"/>
-    <w:basedOn w:val="898"/>
-    <w:link w:val="841"/>
+    <w:basedOn w:val="908"/>
+    <w:link w:val="851"/>
     <w:uiPriority w:val="9"/>
     <w:pPr>
       <w:pBdr/>
@@ -38017,10 +38105,10 @@
       <w:color w:val="0f4761" w:themeColor="accent1" w:themeShade="BF"/>
     </w:rPr>
   </w:style>
-  <w:style w:type="character" w:styleId="851">
+  <w:style w:type="character" w:styleId="861">
     <w:name w:val="Heading 5 Char"/>
-    <w:basedOn w:val="898"/>
-    <w:link w:val="842"/>
+    <w:basedOn w:val="908"/>
+    <w:link w:val="852"/>
     <w:uiPriority w:val="9"/>
     <w:pPr>
       <w:pBdr/>
@@ -38032,10 +38120,10 @@
       <w:color w:val="0f4761" w:themeColor="accent1" w:themeShade="BF"/>
     </w:rPr>
   </w:style>
-  <w:style w:type="character" w:styleId="852">
+  <w:style w:type="character" w:styleId="862">
     <w:name w:val="Heading 6 Char"/>
-    <w:basedOn w:val="898"/>
-    <w:link w:val="843"/>
+    <w:basedOn w:val="908"/>
+    <w:link w:val="853"/>
     <w:uiPriority w:val="9"/>
     <w:pPr>
       <w:pBdr/>
@@ -38049,10 +38137,10 @@
       <w:color w:val="595959" w:themeColor="text1" w:themeTint="A6"/>
     </w:rPr>
   </w:style>
-  <w:style w:type="character" w:styleId="853">
+  <w:style w:type="character" w:styleId="863">
     <w:name w:val="Heading 7 Char"/>
-    <w:basedOn w:val="898"/>
-    <w:link w:val="844"/>
+    <w:basedOn w:val="908"/>
+    <w:link w:val="854"/>
     <w:uiPriority w:val="9"/>
     <w:pPr>
       <w:pBdr/>
@@ -38064,10 +38152,10 @@
       <w:color w:val="595959" w:themeColor="text1" w:themeTint="A6"/>
     </w:rPr>
   </w:style>
-  <w:style w:type="character" w:styleId="854">
+  <w:style w:type="character" w:styleId="864">
     <w:name w:val="Heading 8 Char"/>
-    <w:basedOn w:val="898"/>
-    <w:link w:val="845"/>
+    <w:basedOn w:val="908"/>
+    <w:link w:val="855"/>
     <w:uiPriority w:val="9"/>
     <w:pPr>
       <w:pBdr/>
@@ -38081,10 +38169,10 @@
       <w:color w:val="272727" w:themeColor="text1" w:themeTint="D8"/>
     </w:rPr>
   </w:style>
-  <w:style w:type="character" w:styleId="855">
+  <w:style w:type="character" w:styleId="865">
     <w:name w:val="Heading 9 Char"/>
-    <w:basedOn w:val="898"/>
-    <w:link w:val="846"/>
+    <w:basedOn w:val="908"/>
+    <w:link w:val="856"/>
     <w:uiPriority w:val="9"/>
     <w:pPr>
       <w:pBdr/>
@@ -38098,11 +38186,11 @@
       <w:color w:val="272727" w:themeColor="text1" w:themeTint="D8"/>
     </w:rPr>
   </w:style>
-  <w:style w:type="paragraph" w:styleId="856">
+  <w:style w:type="paragraph" w:styleId="866">
     <w:name w:val="Title"/>
-    <w:basedOn w:val="897"/>
-    <w:next w:val="897"/>
-    <w:link w:val="857"/>
+    <w:basedOn w:val="907"/>
+    <w:next w:val="907"/>
+    <w:link w:val="867"/>
     <w:uiPriority w:val="10"/>
     <w:qFormat/>
     <w:pPr>
@@ -38118,10 +38206,10 @@
       <w:szCs w:val="56"/>
     </w:rPr>
   </w:style>
-  <w:style w:type="character" w:styleId="857">
+  <w:style w:type="character" w:styleId="867">
     <w:name w:val="Title Char"/>
-    <w:basedOn w:val="898"/>
-    <w:link w:val="856"/>
+    <w:basedOn w:val="908"/>
+    <w:link w:val="866"/>
     <w:uiPriority w:val="10"/>
     <w:pPr>
       <w:pBdr/>
@@ -38135,11 +38223,11 @@
       <w:szCs w:val="56"/>
     </w:rPr>
   </w:style>
-  <w:style w:type="paragraph" w:styleId="858">
+  <w:style w:type="paragraph" w:styleId="868">
     <w:name w:val="Subtitle"/>
-    <w:basedOn w:val="897"/>
-    <w:next w:val="897"/>
-    <w:link w:val="859"/>
+    <w:basedOn w:val="907"/>
+    <w:next w:val="907"/>
+    <w:link w:val="869"/>
     <w:uiPriority w:val="11"/>
     <w:qFormat/>
     <w:pPr>
@@ -38157,10 +38245,10 @@
       <w:szCs w:val="28"/>
     </w:rPr>
   </w:style>
-  <w:style w:type="character" w:styleId="859">
+  <w:style w:type="character" w:styleId="869">
     <w:name w:val="Subtitle Char"/>
-    <w:basedOn w:val="898"/>
-    <w:link w:val="858"/>
+    <w:basedOn w:val="908"/>
+    <w:link w:val="868"/>
     <w:uiPriority w:val="11"/>
     <w:pPr>
       <w:pBdr/>
@@ -38174,11 +38262,11 @@
       <w:szCs w:val="28"/>
     </w:rPr>
   </w:style>
-  <w:style w:type="paragraph" w:styleId="860">
+  <w:style w:type="paragraph" w:styleId="870">
     <w:name w:val="Quote"/>
-    <w:basedOn w:val="897"/>
-    <w:next w:val="897"/>
-    <w:link w:val="861"/>
+    <w:basedOn w:val="907"/>
+    <w:next w:val="907"/>
+    <w:link w:val="871"/>
     <w:uiPriority w:val="29"/>
     <w:qFormat/>
     <w:pPr>
@@ -38193,10 +38281,10 @@
       <w:color w:val="404040" w:themeColor="text1" w:themeTint="BF"/>
     </w:rPr>
   </w:style>
-  <w:style w:type="character" w:styleId="861">
+  <w:style w:type="character" w:styleId="871">
     <w:name w:val="Quote Char"/>
-    <w:basedOn w:val="898"/>
-    <w:link w:val="860"/>
+    <w:basedOn w:val="908"/>
+    <w:link w:val="870"/>
     <w:uiPriority w:val="29"/>
     <w:pPr>
       <w:pBdr/>
@@ -38209,9 +38297,9 @@
       <w:color w:val="404040" w:themeColor="text1" w:themeTint="BF"/>
     </w:rPr>
   </w:style>
-  <w:style w:type="character" w:styleId="862">
+  <w:style w:type="character" w:styleId="872">
     <w:name w:val="Intense Emphasis"/>
-    <w:basedOn w:val="898"/>
+    <w:basedOn w:val="908"/>
     <w:uiPriority w:val="21"/>
     <w:qFormat/>
     <w:pPr>
@@ -38225,11 +38313,11 @@
       <w:color w:val="0f4761" w:themeColor="accent1" w:themeShade="BF"/>
     </w:rPr>
   </w:style>
-  <w:style w:type="paragraph" w:styleId="863">
+  <w:style w:type="paragraph" w:styleId="873">
     <w:name w:val="Intense Quote"/>
-    <w:basedOn w:val="897"/>
-    <w:next w:val="897"/>
-    <w:link w:val="864"/>
+    <w:basedOn w:val="907"/>
+    <w:next w:val="907"/>
+    <w:link w:val="874"/>
     <w:uiPriority w:val="30"/>
     <w:qFormat/>
     <w:pPr>
@@ -38247,10 +38335,10 @@
       <w:color w:val="0f4761" w:themeColor="accent1" w:themeShade="BF"/>
     </w:rPr>
   </w:style>
-  <w:style w:type="character" w:styleId="864">
+  <w:style w:type="character" w:styleId="874">
     <w:name w:val="Intense Quote Char"/>
-    <w:basedOn w:val="898"/>
-    <w:link w:val="863"/>
+    <w:basedOn w:val="908"/>
+    <w:link w:val="873"/>
     <w:uiPriority w:val="30"/>
     <w:pPr>
       <w:pBdr/>
@@ -38263,9 +38351,9 @@
       <w:color w:val="0f4761" w:themeColor="accent1" w:themeShade="BF"/>
     </w:rPr>
   </w:style>
-  <w:style w:type="character" w:styleId="865">
+  <w:style w:type="character" w:styleId="875">
     <w:name w:val="Intense Reference"/>
-    <w:basedOn w:val="898"/>
+    <w:basedOn w:val="908"/>
     <w:uiPriority w:val="32"/>
     <w:qFormat/>
     <w:pPr>
@@ -38281,9 +38369,9 @@
       <w:spacing w:val="5"/>
     </w:rPr>
   </w:style>
-  <w:style w:type="paragraph" w:styleId="866">
+  <w:style w:type="paragraph" w:styleId="876">
     <w:name w:val="No Spacing"/>
-    <w:basedOn w:val="897"/>
+    <w:basedOn w:val="907"/>
     <w:uiPriority w:val="1"/>
     <w:qFormat/>
     <w:pPr>
@@ -38292,9 +38380,9 @@
       <w:ind/>
     </w:pPr>
   </w:style>
-  <w:style w:type="character" w:styleId="867">
+  <w:style w:type="character" w:styleId="877">
     <w:name w:val="Subtle Emphasis"/>
-    <w:basedOn w:val="898"/>
+    <w:basedOn w:val="908"/>
     <w:uiPriority w:val="19"/>
     <w:qFormat/>
     <w:pPr>
@@ -38308,9 +38396,9 @@
       <w:color w:val="404040" w:themeColor="text1" w:themeTint="BF"/>
     </w:rPr>
   </w:style>
-  <w:style w:type="character" w:styleId="868">
+  <w:style w:type="character" w:styleId="878">
     <w:name w:val="Emphasis"/>
-    <w:basedOn w:val="898"/>
+    <w:basedOn w:val="908"/>
     <w:uiPriority w:val="20"/>
     <w:qFormat/>
     <w:pPr>
@@ -38323,9 +38411,9 @@
       <w:iCs/>
     </w:rPr>
   </w:style>
-  <w:style w:type="character" w:styleId="869">
+  <w:style w:type="character" w:styleId="879">
     <w:name w:val="Strong"/>
-    <w:basedOn w:val="898"/>
+    <w:basedOn w:val="908"/>
     <w:uiPriority w:val="22"/>
     <w:qFormat/>
     <w:pPr>
@@ -38338,9 +38426,9 @@
       <w:bCs/>
     </w:rPr>
   </w:style>
-  <w:style w:type="character" w:styleId="870">
+  <w:style w:type="character" w:styleId="880">
     <w:name w:val="Subtle Reference"/>
-    <w:basedOn w:val="898"/>
+    <w:basedOn w:val="908"/>
     <w:uiPriority w:val="31"/>
     <w:qFormat/>
     <w:pPr>
@@ -38353,9 +38441,9 @@
       <w:color w:val="5a5a5a" w:themeColor="text1" w:themeTint="A5"/>
     </w:rPr>
   </w:style>
-  <w:style w:type="character" w:styleId="871">
+  <w:style w:type="character" w:styleId="881">
     <w:name w:val="Book Title"/>
-    <w:basedOn w:val="898"/>
+    <w:basedOn w:val="908"/>
     <w:uiPriority w:val="33"/>
     <w:qFormat/>
     <w:pPr>
@@ -38371,10 +38459,10 @@
       <w:spacing w:val="5"/>
     </w:rPr>
   </w:style>
-  <w:style w:type="paragraph" w:styleId="872">
+  <w:style w:type="paragraph" w:styleId="882">
     <w:name w:val="Header"/>
-    <w:basedOn w:val="897"/>
-    <w:link w:val="873"/>
+    <w:basedOn w:val="907"/>
+    <w:link w:val="883"/>
     <w:uiPriority w:val="99"/>
     <w:unhideWhenUsed/>
     <w:pPr>
@@ -38387,10 +38475,10 @@
       <w:ind/>
     </w:pPr>
   </w:style>
-  <w:style w:type="character" w:styleId="873">
+  <w:style w:type="character" w:styleId="883">
     <w:name w:val="Header Char"/>
-    <w:basedOn w:val="898"/>
-    <w:link w:val="872"/>
+    <w:basedOn w:val="908"/>
+    <w:link w:val="882"/>
     <w:uiPriority w:val="99"/>
     <w:pPr>
       <w:pBdr/>
@@ -38398,10 +38486,10 @@
       <w:ind/>
     </w:pPr>
   </w:style>
-  <w:style w:type="paragraph" w:styleId="874">
+  <w:style w:type="paragraph" w:styleId="884">
     <w:name w:val="Footer"/>
-    <w:basedOn w:val="897"/>
-    <w:link w:val="875"/>
+    <w:basedOn w:val="907"/>
+    <w:link w:val="885"/>
     <w:uiPriority w:val="99"/>
     <w:unhideWhenUsed/>
     <w:pPr>
@@ -38414,10 +38502,10 @@
       <w:ind/>
     </w:pPr>
   </w:style>
-  <w:style w:type="character" w:styleId="875">
+  <w:style w:type="character" w:styleId="885">
     <w:name w:val="Footer Char"/>
-    <w:basedOn w:val="898"/>
-    <w:link w:val="874"/>
+    <w:basedOn w:val="908"/>
+    <w:link w:val="884"/>
     <w:uiPriority w:val="99"/>
     <w:pPr>
       <w:pBdr/>
@@ -38425,10 +38513,10 @@
       <w:ind/>
     </w:pPr>
   </w:style>
-  <w:style w:type="paragraph" w:styleId="876">
+  <w:style w:type="paragraph" w:styleId="886">
     <w:name w:val="Caption"/>
-    <w:basedOn w:val="897"/>
-    <w:next w:val="897"/>
+    <w:basedOn w:val="907"/>
+    <w:next w:val="907"/>
     <w:uiPriority w:val="35"/>
     <w:unhideWhenUsed/>
     <w:qFormat/>
@@ -38445,10 +38533,10 @@
       <w:szCs w:val="18"/>
     </w:rPr>
   </w:style>
-  <w:style w:type="paragraph" w:styleId="877">
+  <w:style w:type="paragraph" w:styleId="887">
     <w:name w:val="footnote text"/>
-    <w:basedOn w:val="897"/>
-    <w:link w:val="878"/>
+    <w:basedOn w:val="907"/>
+    <w:link w:val="888"/>
     <w:uiPriority w:val="99"/>
     <w:semiHidden/>
     <w:unhideWhenUsed/>
@@ -38462,10 +38550,10 @@
       <w:szCs w:val="20"/>
     </w:rPr>
   </w:style>
-  <w:style w:type="character" w:styleId="878">
+  <w:style w:type="character" w:styleId="888">
     <w:name w:val="Footnote Text Char"/>
-    <w:basedOn w:val="898"/>
-    <w:link w:val="877"/>
+    <w:basedOn w:val="908"/>
+    <w:link w:val="887"/>
     <w:uiPriority w:val="99"/>
     <w:semiHidden/>
     <w:pPr>
@@ -38478,9 +38566,9 @@
       <w:szCs w:val="20"/>
     </w:rPr>
   </w:style>
-  <w:style w:type="character" w:styleId="879">
+  <w:style w:type="character" w:styleId="889">
     <w:name w:val="footnote reference"/>
-    <w:basedOn w:val="898"/>
+    <w:basedOn w:val="908"/>
     <w:uiPriority w:val="99"/>
     <w:semiHidden/>
     <w:unhideWhenUsed/>
@@ -38493,10 +38581,10 @@
       <w:vertAlign w:val="superscript"/>
     </w:rPr>
   </w:style>
-  <w:style w:type="paragraph" w:styleId="880">
+  <w:style w:type="paragraph" w:styleId="890">
     <w:name w:val="endnote text"/>
-    <w:basedOn w:val="897"/>
-    <w:link w:val="881"/>
+    <w:basedOn w:val="907"/>
+    <w:link w:val="891"/>
     <w:uiPriority w:val="99"/>
     <w:semiHidden/>
     <w:unhideWhenUsed/>
@@ -38510,10 +38598,10 @@
       <w:szCs w:val="20"/>
     </w:rPr>
   </w:style>
-  <w:style w:type="character" w:styleId="881">
+  <w:style w:type="character" w:styleId="891">
     <w:name w:val="Endnote Text Char"/>
-    <w:basedOn w:val="898"/>
-    <w:link w:val="880"/>
+    <w:basedOn w:val="908"/>
+    <w:link w:val="890"/>
     <w:uiPriority w:val="99"/>
     <w:semiHidden/>
     <w:pPr>
@@ -38526,9 +38614,9 @@
       <w:szCs w:val="20"/>
     </w:rPr>
   </w:style>
-  <w:style w:type="character" w:styleId="882">
+  <w:style w:type="character" w:styleId="892">
     <w:name w:val="endnote reference"/>
-    <w:basedOn w:val="898"/>
+    <w:basedOn w:val="908"/>
     <w:uiPriority w:val="99"/>
     <w:semiHidden/>
     <w:unhideWhenUsed/>
@@ -38541,9 +38629,9 @@
       <w:vertAlign w:val="superscript"/>
     </w:rPr>
   </w:style>
-  <w:style w:type="character" w:styleId="883">
+  <w:style w:type="character" w:styleId="893">
     <w:name w:val="Hyperlink"/>
-    <w:basedOn w:val="898"/>
+    <w:basedOn w:val="908"/>
     <w:uiPriority w:val="99"/>
     <w:unhideWhenUsed/>
     <w:pPr>
@@ -38556,9 +38644,9 @@
       <w:u w:val="single"/>
     </w:rPr>
   </w:style>
-  <w:style w:type="character" w:styleId="884">
+  <w:style w:type="character" w:styleId="894">
     <w:name w:val="FollowedHyperlink"/>
-    <w:basedOn w:val="898"/>
+    <w:basedOn w:val="908"/>
     <w:uiPriority w:val="99"/>
     <w:semiHidden/>
     <w:unhideWhenUsed/>
@@ -38572,10 +38660,10 @@
       <w:u w:val="single"/>
     </w:rPr>
   </w:style>
-  <w:style w:type="paragraph" w:styleId="885">
+  <w:style w:type="paragraph" w:styleId="895">
     <w:name w:val="toc 1"/>
-    <w:basedOn w:val="897"/>
-    <w:next w:val="897"/>
+    <w:basedOn w:val="907"/>
+    <w:next w:val="907"/>
     <w:uiPriority w:val="39"/>
     <w:unhideWhenUsed/>
     <w:pPr>
@@ -38584,10 +38672,10 @@
       <w:ind/>
     </w:pPr>
   </w:style>
-  <w:style w:type="paragraph" w:styleId="886">
+  <w:style w:type="paragraph" w:styleId="896">
     <w:name w:val="toc 2"/>
-    <w:basedOn w:val="897"/>
-    <w:next w:val="897"/>
+    <w:basedOn w:val="907"/>
+    <w:next w:val="907"/>
     <w:uiPriority w:val="39"/>
     <w:unhideWhenUsed/>
     <w:pPr>
@@ -38596,10 +38684,10 @@
       <w:ind w:left="220"/>
     </w:pPr>
   </w:style>
-  <w:style w:type="paragraph" w:styleId="887">
+  <w:style w:type="paragraph" w:styleId="897">
     <w:name w:val="toc 3"/>
-    <w:basedOn w:val="897"/>
-    <w:next w:val="897"/>
+    <w:basedOn w:val="907"/>
+    <w:next w:val="907"/>
     <w:uiPriority w:val="39"/>
     <w:unhideWhenUsed/>
     <w:pPr>
@@ -38608,10 +38696,10 @@
       <w:ind w:left="440"/>
     </w:pPr>
   </w:style>
-  <w:style w:type="paragraph" w:styleId="888">
+  <w:style w:type="paragraph" w:styleId="898">
     <w:name w:val="toc 4"/>
-    <w:basedOn w:val="897"/>
-    <w:next w:val="897"/>
+    <w:basedOn w:val="907"/>
+    <w:next w:val="907"/>
     <w:uiPriority w:val="39"/>
     <w:unhideWhenUsed/>
     <w:pPr>
@@ -38620,10 +38708,10 @@
       <w:ind w:left="660"/>
     </w:pPr>
   </w:style>
-  <w:style w:type="paragraph" w:styleId="889">
+  <w:style w:type="paragraph" w:styleId="899">
     <w:name w:val="toc 5"/>
-    <w:basedOn w:val="897"/>
-    <w:next w:val="897"/>
+    <w:basedOn w:val="907"/>
+    <w:next w:val="907"/>
     <w:uiPriority w:val="39"/>
     <w:unhideWhenUsed/>
     <w:pPr>
@@ -38632,10 +38720,10 @@
       <w:ind w:left="880"/>
     </w:pPr>
   </w:style>
-  <w:style w:type="paragraph" w:styleId="890">
+  <w:style w:type="paragraph" w:styleId="900">
     <w:name w:val="toc 6"/>
-    <w:basedOn w:val="897"/>
-    <w:next w:val="897"/>
+    <w:basedOn w:val="907"/>
+    <w:next w:val="907"/>
     <w:uiPriority w:val="39"/>
     <w:unhideWhenUsed/>
     <w:pPr>
@@ -38644,10 +38732,10 @@
       <w:ind w:left="1100"/>
     </w:pPr>
   </w:style>
-  <w:style w:type="paragraph" w:styleId="891">
+  <w:style w:type="paragraph" w:styleId="901">
     <w:name w:val="toc 7"/>
-    <w:basedOn w:val="897"/>
-    <w:next w:val="897"/>
+    <w:basedOn w:val="907"/>
+    <w:next w:val="907"/>
     <w:uiPriority w:val="39"/>
     <w:unhideWhenUsed/>
     <w:pPr>
@@ -38656,10 +38744,10 @@
       <w:ind w:left="1320"/>
     </w:pPr>
   </w:style>
-  <w:style w:type="paragraph" w:styleId="892">
+  <w:style w:type="paragraph" w:styleId="902">
     <w:name w:val="toc 8"/>
-    <w:basedOn w:val="897"/>
-    <w:next w:val="897"/>
+    <w:basedOn w:val="907"/>
+    <w:next w:val="907"/>
     <w:uiPriority w:val="39"/>
     <w:unhideWhenUsed/>
     <w:pPr>
@@ -38668,10 +38756,10 @@
       <w:ind w:left="1540"/>
     </w:pPr>
   </w:style>
-  <w:style w:type="paragraph" w:styleId="893">
+  <w:style w:type="paragraph" w:styleId="903">
     <w:name w:val="toc 9"/>
-    <w:basedOn w:val="897"/>
-    <w:next w:val="897"/>
+    <w:basedOn w:val="907"/>
+    <w:next w:val="907"/>
     <w:uiPriority w:val="39"/>
     <w:unhideWhenUsed/>
     <w:pPr>
@@ -38680,9 +38768,9 @@
       <w:ind w:left="1760"/>
     </w:pPr>
   </w:style>
-  <w:style w:type="character" w:styleId="894">
+  <w:style w:type="character" w:styleId="904">
     <w:name w:val="Placeholder Text"/>
-    <w:basedOn w:val="898"/>
+    <w:basedOn w:val="908"/>
     <w:uiPriority w:val="99"/>
     <w:semiHidden/>
     <w:pPr>
@@ -38694,7 +38782,7 @@
       <w:color w:val="666666"/>
     </w:rPr>
   </w:style>
-  <w:style w:type="paragraph" w:styleId="895">
+  <w:style w:type="paragraph" w:styleId="905">
     <w:name w:val="TOC Heading"/>
     <w:uiPriority w:val="39"/>
     <w:unhideWhenUsed/>
@@ -38704,10 +38792,10 @@
       <w:ind/>
     </w:pPr>
   </w:style>
-  <w:style w:type="paragraph" w:styleId="896">
+  <w:style w:type="paragraph" w:styleId="906">
     <w:name w:val="table of figures"/>
-    <w:basedOn w:val="897"/>
-    <w:next w:val="897"/>
+    <w:basedOn w:val="907"/>
+    <w:next w:val="907"/>
     <w:uiPriority w:val="99"/>
     <w:unhideWhenUsed/>
     <w:pPr>
@@ -38716,7 +38804,7 @@
       <w:ind/>
     </w:pPr>
   </w:style>
-  <w:style w:type="paragraph" w:styleId="897" w:default="1">
+  <w:style w:type="paragraph" w:styleId="907" w:default="1">
     <w:name w:val="Normal"/>
     <w:qFormat/>
     <w:pPr>
@@ -38729,7 +38817,7 @@
       <w:lang w:val="en-US"/>
     </w:rPr>
   </w:style>
-  <w:style w:type="character" w:styleId="898" w:default="1">
+  <w:style w:type="character" w:styleId="908" w:default="1">
     <w:name w:val="Default Paragraph Font"/>
     <w:uiPriority w:val="1"/>
     <w:semiHidden/>
@@ -38740,7 +38828,7 @@
       <w:ind/>
     </w:pPr>
   </w:style>
-  <w:style w:type="table" w:styleId="899" w:default="1">
+  <w:style w:type="table" w:styleId="909" w:default="1">
     <w:name w:val="Normal Table"/>
     <w:uiPriority w:val="99"/>
     <w:semiHidden/>
@@ -38933,7 +39021,7 @@
       </w:tcPr>
     </w:tblStylePr>
   </w:style>
-  <w:style w:type="numbering" w:styleId="900" w:default="1">
+  <w:style w:type="numbering" w:styleId="910" w:default="1">
     <w:name w:val="No List"/>
     <w:uiPriority w:val="99"/>
     <w:semiHidden/>
@@ -38944,9 +39032,9 @@
       <w:ind/>
     </w:pPr>
   </w:style>
-  <w:style w:type="paragraph" w:styleId="901">
+  <w:style w:type="paragraph" w:styleId="911">
     <w:name w:val="Balloon Text"/>
-    <w:basedOn w:val="897"/>
+    <w:basedOn w:val="907"/>
     <w:pPr>
       <w:pBdr/>
       <w:spacing/>
@@ -38958,9 +39046,9 @@
       <w:szCs w:val="16"/>
     </w:rPr>
   </w:style>
-  <w:style w:type="character" w:styleId="902">
+  <w:style w:type="character" w:styleId="912">
     <w:name w:val="annotation reference"/>
-    <w:basedOn w:val="898"/>
+    <w:basedOn w:val="908"/>
     <w:pPr>
       <w:pBdr/>
       <w:spacing/>
@@ -38971,19 +39059,19 @@
       <w:szCs w:val="16"/>
     </w:rPr>
   </w:style>
-  <w:style w:type="paragraph" w:styleId="903">
+  <w:style w:type="paragraph" w:styleId="913">
     <w:name w:val="annotation text"/>
-    <w:basedOn w:val="897"/>
+    <w:basedOn w:val="907"/>
     <w:pPr>
       <w:pBdr/>
       <w:spacing/>
       <w:ind/>
     </w:pPr>
   </w:style>
-  <w:style w:type="paragraph" w:styleId="904">
+  <w:style w:type="paragraph" w:styleId="914">
     <w:name w:val="annotation subject"/>
-    <w:basedOn w:val="903"/>
-    <w:next w:val="903"/>
+    <w:basedOn w:val="913"/>
+    <w:next w:val="913"/>
     <w:pPr>
       <w:pBdr/>
       <w:spacing/>
@@ -38994,9 +39082,9 @@
       <w:bCs/>
     </w:rPr>
   </w:style>
-  <w:style w:type="paragraph" w:styleId="905">
+  <w:style w:type="paragraph" w:styleId="915">
     <w:name w:val="List Paragraph"/>
-    <w:basedOn w:val="897"/>
+    <w:basedOn w:val="907"/>
     <w:qFormat/>
     <w:pPr>
       <w:pBdr/>
@@ -39004,9 +39092,9 @@
       <w:ind w:left="708"/>
     </w:pPr>
   </w:style>
-  <w:style w:type="table" w:styleId="906">
+  <w:style w:type="table" w:styleId="916">
     <w:name w:val="Table Grid"/>
-    <w:basedOn w:val="899"/>
+    <w:basedOn w:val="909"/>
     <w:pPr>
       <w:pBdr/>
       <w:spacing/>

</xml_diff>